<commit_message>
Add graphs to the Word cheatsheet (paths, inventory build-up, queue curves)
Co-Authored-By: Claude Opus 5.5 <noreply@anthropic.com>
Claude-Session: https://claude.ai/code/session_01SQ1ernijXLTkrk7DHxTTop
</commit_message>
<xml_diff>
--- a/notes/cheatsheet/DOTE2030_Midterm_Cheatsheet.docx
+++ b/notes/cheatsheet/DOTE2030_Midterm_Cheatsheet.docx
@@ -130,6 +130,7 @@
       <w:tr>
         <w:trPr>
           <w:cantSplit/>
+          <w:tblHeader/>
         </w:trPr>
         <w:tc>
           <w:tcPr>
@@ -234,6 +235,7 @@
       <w:tr>
         <w:trPr>
           <w:cantSplit/>
+          <w:tblHeader w:val="false"/>
         </w:trPr>
         <w:tc>
           <w:tcPr>
@@ -329,6 +331,7 @@
       <w:tr>
         <w:trPr>
           <w:cantSplit/>
+          <w:tblHeader w:val="false"/>
         </w:trPr>
         <w:tc>
           <w:tcPr>
@@ -424,6 +427,7 @@
       <w:tr>
         <w:trPr>
           <w:cantSplit/>
+          <w:tblHeader w:val="false"/>
         </w:trPr>
         <w:tc>
           <w:tcPr>
@@ -519,6 +523,7 @@
       <w:tr>
         <w:trPr>
           <w:cantSplit/>
+          <w:tblHeader w:val="false"/>
         </w:trPr>
         <w:tc>
           <w:tcPr>
@@ -614,6 +619,7 @@
       <w:tr>
         <w:trPr>
           <w:cantSplit/>
+          <w:tblHeader w:val="false"/>
         </w:trPr>
         <w:tc>
           <w:tcPr>
@@ -709,6 +715,7 @@
       <w:tr>
         <w:trPr>
           <w:cantSplit/>
+          <w:tblHeader w:val="false"/>
         </w:trPr>
         <w:tc>
           <w:tcPr>
@@ -804,6 +811,7 @@
       <w:tr>
         <w:trPr>
           <w:cantSplit/>
+          <w:tblHeader w:val="false"/>
         </w:trPr>
         <w:tc>
           <w:tcPr>
@@ -899,6 +907,7 @@
       <w:tr>
         <w:trPr>
           <w:cantSplit/>
+          <w:tblHeader w:val="false"/>
         </w:trPr>
         <w:tc>
           <w:tcPr>
@@ -994,6 +1003,7 @@
       <w:tr>
         <w:trPr>
           <w:cantSplit/>
+          <w:tblHeader w:val="false"/>
         </w:trPr>
         <w:tc>
           <w:tcPr>
@@ -1115,6 +1125,7 @@
       <w:tr>
         <w:trPr>
           <w:cantSplit/>
+          <w:tblHeader w:val="false"/>
         </w:trPr>
         <w:tc>
           <w:tcPr>
@@ -1236,6 +1247,7 @@
       <w:tr>
         <w:trPr>
           <w:cantSplit/>
+          <w:tblHeader w:val="false"/>
         </w:trPr>
         <w:tc>
           <w:tcPr>
@@ -1374,6 +1386,7 @@
       <w:tr>
         <w:trPr>
           <w:cantSplit/>
+          <w:tblHeader w:val="false"/>
         </w:trPr>
         <w:tc>
           <w:tcPr>
@@ -1907,6 +1920,53 @@
           <w:szCs w:val="10"/>
         </w:rPr>
         <w:t xml:space="preserve">• some activities done at the same time (parallel): take the LONGEST path</w:t>
+      </w:r>
+    </w:p>
+    <w:p>
+      <w:pPr>
+        <w:keepLines/>
+        <w:spacing w:after="16" w:before="10"/>
+        <w:jc w:val="center"/>
+      </w:pPr>
+      <w:r>
+        <w:drawing>
+          <wp:inline distT="0" distB="0" distL="0" distR="0">
+            <wp:extent cx="2295525" cy="571500"/>
+            <wp:effectExtent t="0" r="0" b="0" l="0"/>
+            <wp:docPr id="1" name="fig_paths" descr="fig_paths" title="fig_paths"/>
+            <wp:cNvGraphicFramePr>
+              <a:graphicFrameLocks xmlns:a="http://schemas.openxmlformats.org/drawingml/2006/main" noChangeAspect="1"/>
+            </wp:cNvGraphicFramePr>
+            <a:graphic xmlns:a="http://schemas.openxmlformats.org/drawingml/2006/main">
+              <a:graphicData uri="http://schemas.openxmlformats.org/drawingml/2006/picture">
+                <pic:pic xmlns:pic="http://schemas.openxmlformats.org/drawingml/2006/picture">
+                  <pic:nvPicPr>
+                    <pic:cNvPr id="0" name="" descr=""/>
+                    <pic:cNvPicPr>
+                      <a:picLocks noChangeAspect="1" noChangeArrowheads="1"/>
+                    </pic:cNvPicPr>
+                  </pic:nvPicPr>
+                  <pic:blipFill>
+                    <a:blip r:embed="rId7" cstate="none"/>
+                    <a:srcRect/>
+                    <a:stretch>
+                      <a:fillRect/>
+                    </a:stretch>
+                  </pic:blipFill>
+                  <pic:spPr bwMode="auto">
+                    <a:xfrm>
+                      <a:off x="0" y="0"/>
+                      <a:ext cx="2295525" cy="571500"/>
+                    </a:xfrm>
+                    <a:prstGeom prst="rect">
+                      <a:avLst/>
+                    </a:prstGeom>
+                  </pic:spPr>
+                </pic:pic>
+              </a:graphicData>
+            </a:graphic>
+          </wp:inline>
+        </w:drawing>
       </w:r>
     </w:p>
     <w:p>
@@ -3405,6 +3465,7 @@
       <w:tr>
         <w:trPr>
           <w:cantSplit/>
+          <w:tblHeader/>
         </w:trPr>
         <w:tc>
           <w:tcPr>
@@ -3476,6 +3537,7 @@
       <w:tr>
         <w:trPr>
           <w:cantSplit/>
+          <w:tblHeader w:val="false"/>
         </w:trPr>
         <w:tc>
           <w:tcPr>
@@ -3541,6 +3603,7 @@
       <w:tr>
         <w:trPr>
           <w:cantSplit/>
+          <w:tblHeader w:val="false"/>
         </w:trPr>
         <w:tc>
           <w:tcPr>
@@ -3606,6 +3669,7 @@
       <w:tr>
         <w:trPr>
           <w:cantSplit/>
+          <w:tblHeader w:val="false"/>
         </w:trPr>
         <w:tc>
           <w:tcPr>
@@ -3671,6 +3735,7 @@
       <w:tr>
         <w:trPr>
           <w:cantSplit/>
+          <w:tblHeader w:val="false"/>
         </w:trPr>
         <w:tc>
           <w:tcPr>
@@ -4410,6 +4475,7 @@
       <w:tr>
         <w:trPr>
           <w:cantSplit/>
+          <w:tblHeader/>
         </w:trPr>
         <w:tc>
           <w:tcPr>
@@ -4514,6 +4580,7 @@
       <w:tr>
         <w:trPr>
           <w:cantSplit/>
+          <w:tblHeader w:val="false"/>
         </w:trPr>
         <w:tc>
           <w:tcPr>
@@ -4609,6 +4676,7 @@
       <w:tr>
         <w:trPr>
           <w:cantSplit/>
+          <w:tblHeader w:val="false"/>
         </w:trPr>
         <w:tc>
           <w:tcPr>
@@ -4704,6 +4772,7 @@
       <w:tr>
         <w:trPr>
           <w:cantSplit/>
+          <w:tblHeader w:val="false"/>
         </w:trPr>
         <w:tc>
           <w:tcPr>
@@ -4799,6 +4868,7 @@
       <w:tr>
         <w:trPr>
           <w:cantSplit/>
+          <w:tblHeader w:val="false"/>
         </w:trPr>
         <w:tc>
           <w:tcPr>
@@ -4894,6 +4964,7 @@
       <w:tr>
         <w:trPr>
           <w:cantSplit/>
+          <w:tblHeader w:val="false"/>
         </w:trPr>
         <w:tc>
           <w:tcPr>
@@ -5213,6 +5284,53 @@
           <w:szCs w:val="10"/>
         </w:rPr>
         <w:t xml:space="preserve">: (1) inventory at each time the rate changes; (2) if the queue shrinks, find the exact time it hits 0; (3) cut the area into triangles (½ × base × height) and rectangles (base × height); (4) divide by the WHOLE time window, including the zero parts.</w:t>
+      </w:r>
+    </w:p>
+    <w:p>
+      <w:pPr>
+        <w:keepLines/>
+        <w:spacing w:after="16" w:before="10"/>
+        <w:jc w:val="center"/>
+      </w:pPr>
+      <w:r>
+        <w:drawing>
+          <wp:inline distT="0" distB="0" distL="0" distR="0">
+            <wp:extent cx="2295525" cy="962025"/>
+            <wp:effectExtent t="0" r="0" b="0" l="0"/>
+            <wp:docPr id="1" name="fig_inventory" descr="fig_inventory" title="fig_inventory"/>
+            <wp:cNvGraphicFramePr>
+              <a:graphicFrameLocks xmlns:a="http://schemas.openxmlformats.org/drawingml/2006/main" noChangeAspect="1"/>
+            </wp:cNvGraphicFramePr>
+            <a:graphic xmlns:a="http://schemas.openxmlformats.org/drawingml/2006/main">
+              <a:graphicData uri="http://schemas.openxmlformats.org/drawingml/2006/picture">
+                <pic:pic xmlns:pic="http://schemas.openxmlformats.org/drawingml/2006/picture">
+                  <pic:nvPicPr>
+                    <pic:cNvPr id="0" name="" descr=""/>
+                    <pic:cNvPicPr>
+                      <a:picLocks noChangeAspect="1" noChangeArrowheads="1"/>
+                    </pic:cNvPicPr>
+                  </pic:nvPicPr>
+                  <pic:blipFill>
+                    <a:blip r:embed="rId8" cstate="none"/>
+                    <a:srcRect/>
+                    <a:stretch>
+                      <a:fillRect/>
+                    </a:stretch>
+                  </pic:blipFill>
+                  <pic:spPr bwMode="auto">
+                    <a:xfrm>
+                      <a:off x="0" y="0"/>
+                      <a:ext cx="2295525" cy="962025"/>
+                    </a:xfrm>
+                    <a:prstGeom prst="rect">
+                      <a:avLst/>
+                    </a:prstGeom>
+                  </pic:spPr>
+                </pic:pic>
+              </a:graphicData>
+            </a:graphic>
+          </wp:inline>
+        </w:drawing>
       </w:r>
     </w:p>
     <w:p>
@@ -6364,6 +6482,7 @@
       <w:tr>
         <w:trPr>
           <w:cantSplit/>
+          <w:tblHeader/>
         </w:trPr>
         <w:tc>
           <w:tcPr>
@@ -6468,6 +6587,7 @@
       <w:tr>
         <w:trPr>
           <w:cantSplit/>
+          <w:tblHeader w:val="false"/>
         </w:trPr>
         <w:tc>
           <w:tcPr>
@@ -6563,6 +6683,7 @@
       <w:tr>
         <w:trPr>
           <w:cantSplit/>
+          <w:tblHeader w:val="false"/>
         </w:trPr>
         <w:tc>
           <w:tcPr>
@@ -6658,6 +6779,7 @@
       <w:tr>
         <w:trPr>
           <w:cantSplit/>
+          <w:tblHeader w:val="false"/>
         </w:trPr>
         <w:tc>
           <w:tcPr>
@@ -6853,6 +6975,7 @@
       <w:tr>
         <w:trPr>
           <w:cantSplit/>
+          <w:tblHeader/>
         </w:trPr>
         <w:tc>
           <w:tcPr>
@@ -6957,6 +7080,7 @@
       <w:tr>
         <w:trPr>
           <w:cantSplit/>
+          <w:tblHeader w:val="false"/>
         </w:trPr>
         <w:tc>
           <w:tcPr>
@@ -7052,6 +7176,7 @@
       <w:tr>
         <w:trPr>
           <w:cantSplit/>
+          <w:tblHeader w:val="false"/>
         </w:trPr>
         <w:tc>
           <w:tcPr>
@@ -7147,6 +7272,7 @@
       <w:tr>
         <w:trPr>
           <w:cantSplit/>
+          <w:tblHeader w:val="false"/>
         </w:trPr>
         <w:tc>
           <w:tcPr>
@@ -7242,6 +7368,7 @@
       <w:tr>
         <w:trPr>
           <w:cantSplit/>
+          <w:tblHeader w:val="false"/>
         </w:trPr>
         <w:tc>
           <w:tcPr>
@@ -7337,6 +7464,7 @@
       <w:tr>
         <w:trPr>
           <w:cantSplit/>
+          <w:tblHeader w:val="false"/>
         </w:trPr>
         <w:tc>
           <w:tcPr>
@@ -7432,6 +7560,7 @@
       <w:tr>
         <w:trPr>
           <w:cantSplit/>
+          <w:tblHeader w:val="false"/>
         </w:trPr>
         <w:tc>
           <w:tcPr>
@@ -8650,6 +8779,7 @@
       <w:tr>
         <w:trPr>
           <w:cantSplit/>
+          <w:tblHeader/>
         </w:trPr>
         <w:tc>
           <w:tcPr>
@@ -8886,6 +9016,7 @@
       <w:tr>
         <w:trPr>
           <w:cantSplit/>
+          <w:tblHeader w:val="false"/>
         </w:trPr>
         <w:tc>
           <w:tcPr>
@@ -9101,6 +9232,7 @@
       <w:tr>
         <w:trPr>
           <w:cantSplit/>
+          <w:tblHeader w:val="false"/>
         </w:trPr>
         <w:tc>
           <w:tcPr>
@@ -9316,6 +9448,7 @@
       <w:tr>
         <w:trPr>
           <w:cantSplit/>
+          <w:tblHeader w:val="false"/>
         </w:trPr>
         <w:tc>
           <w:tcPr>
@@ -9531,6 +9664,7 @@
       <w:tr>
         <w:trPr>
           <w:cantSplit/>
+          <w:tblHeader w:val="false"/>
         </w:trPr>
         <w:tc>
           <w:tcPr>
@@ -9746,6 +9880,7 @@
       <w:tr>
         <w:trPr>
           <w:cantSplit/>
+          <w:tblHeader w:val="false"/>
         </w:trPr>
         <w:tc>
           <w:tcPr>
@@ -9961,6 +10096,7 @@
       <w:tr>
         <w:trPr>
           <w:cantSplit/>
+          <w:tblHeader w:val="false"/>
         </w:trPr>
         <w:tc>
           <w:tcPr>
@@ -10176,6 +10312,7 @@
       <w:tr>
         <w:trPr>
           <w:cantSplit/>
+          <w:tblHeader w:val="false"/>
         </w:trPr>
         <w:tc>
           <w:tcPr>
@@ -10391,6 +10528,7 @@
       <w:tr>
         <w:trPr>
           <w:cantSplit/>
+          <w:tblHeader w:val="false"/>
         </w:trPr>
         <w:tc>
           <w:tcPr>
@@ -10606,6 +10744,7 @@
       <w:tr>
         <w:trPr>
           <w:cantSplit/>
+          <w:tblHeader w:val="false"/>
         </w:trPr>
         <w:tc>
           <w:tcPr>
@@ -10821,6 +10960,7 @@
       <w:tr>
         <w:trPr>
           <w:cantSplit/>
+          <w:tblHeader w:val="false"/>
         </w:trPr>
         <w:tc>
           <w:tcPr>
@@ -11036,6 +11176,7 @@
       <w:tr>
         <w:trPr>
           <w:cantSplit/>
+          <w:tblHeader w:val="false"/>
         </w:trPr>
         <w:tc>
           <w:tcPr>
@@ -11393,6 +11534,7 @@
       <w:tr>
         <w:trPr>
           <w:cantSplit/>
+          <w:tblHeader/>
         </w:trPr>
         <w:tc>
           <w:tcPr>
@@ -11563,6 +11705,7 @@
       <w:tr>
         <w:trPr>
           <w:cantSplit/>
+          <w:tblHeader w:val="false"/>
         </w:trPr>
         <w:tc>
           <w:tcPr>
@@ -11718,6 +11861,7 @@
       <w:tr>
         <w:trPr>
           <w:cantSplit/>
+          <w:tblHeader w:val="false"/>
         </w:trPr>
         <w:tc>
           <w:tcPr>
@@ -11873,6 +12017,7 @@
       <w:tr>
         <w:trPr>
           <w:cantSplit/>
+          <w:tblHeader w:val="false"/>
         </w:trPr>
         <w:tc>
           <w:tcPr>
@@ -12372,6 +12517,7 @@
       <w:tr>
         <w:trPr>
           <w:cantSplit/>
+          <w:tblHeader/>
         </w:trPr>
         <w:tc>
           <w:tcPr>
@@ -12499,6 +12645,7 @@
       <w:tr>
         <w:trPr>
           <w:cantSplit/>
+          <w:tblHeader w:val="false"/>
         </w:trPr>
         <w:tc>
           <w:tcPr>
@@ -12624,6 +12771,7 @@
       <w:tr>
         <w:trPr>
           <w:cantSplit/>
+          <w:tblHeader w:val="false"/>
         </w:trPr>
         <w:tc>
           <w:tcPr>
@@ -12749,6 +12897,7 @@
       <w:tr>
         <w:trPr>
           <w:cantSplit/>
+          <w:tblHeader w:val="false"/>
         </w:trPr>
         <w:tc>
           <w:tcPr>
@@ -12874,6 +13023,7 @@
       <w:tr>
         <w:trPr>
           <w:cantSplit/>
+          <w:tblHeader w:val="false"/>
         </w:trPr>
         <w:tc>
           <w:tcPr>
@@ -12999,6 +13149,7 @@
       <w:tr>
         <w:trPr>
           <w:cantSplit/>
+          <w:tblHeader w:val="false"/>
         </w:trPr>
         <w:tc>
           <w:tcPr>
@@ -13804,6 +13955,7 @@
       <w:tr>
         <w:trPr>
           <w:cantSplit/>
+          <w:tblHeader/>
         </w:trPr>
         <w:tc>
           <w:tcPr>
@@ -14049,6 +14201,7 @@
       <w:tr>
         <w:trPr>
           <w:cantSplit/>
+          <w:tblHeader w:val="false"/>
         </w:trPr>
         <w:tc>
           <w:tcPr>
@@ -14204,6 +14357,7 @@
       <w:tr>
         <w:trPr>
           <w:cantSplit/>
+          <w:tblHeader w:val="false"/>
         </w:trPr>
         <w:tc>
           <w:tcPr>
@@ -14359,6 +14513,7 @@
       <w:tr>
         <w:trPr>
           <w:cantSplit/>
+          <w:tblHeader w:val="false"/>
         </w:trPr>
         <w:tc>
           <w:tcPr>
@@ -14514,6 +14669,7 @@
       <w:tr>
         <w:trPr>
           <w:cantSplit/>
+          <w:tblHeader w:val="false"/>
         </w:trPr>
         <w:tc>
           <w:tcPr>
@@ -14669,6 +14825,7 @@
       <w:tr>
         <w:trPr>
           <w:cantSplit/>
+          <w:tblHeader w:val="false"/>
         </w:trPr>
         <w:tc>
           <w:tcPr>
@@ -14841,6 +14998,7 @@
       <w:tr>
         <w:trPr>
           <w:cantSplit/>
+          <w:tblHeader w:val="false"/>
         </w:trPr>
         <w:tc>
           <w:tcPr>
@@ -16454,6 +16612,7 @@
       <w:tr>
         <w:trPr>
           <w:cantSplit/>
+          <w:tblHeader/>
         </w:trPr>
         <w:tc>
           <w:tcPr>
@@ -16624,6 +16783,7 @@
       <w:tr>
         <w:trPr>
           <w:cantSplit/>
+          <w:tblHeader w:val="false"/>
         </w:trPr>
         <w:tc>
           <w:tcPr>
@@ -16794,6 +16954,53 @@
         </w:tc>
       </w:tr>
     </w:tbl>
+    <w:p>
+      <w:pPr>
+        <w:keepLines/>
+        <w:spacing w:after="16" w:before="10"/>
+        <w:jc w:val="center"/>
+      </w:pPr>
+      <w:r>
+        <w:drawing>
+          <wp:inline distT="0" distB="0" distL="0" distR="0">
+            <wp:extent cx="2295525" cy="1009650"/>
+            <wp:effectExtent t="0" r="0" b="0" l="0"/>
+            <wp:docPr id="1" name="fig_queues" descr="fig_queues" title="fig_queues"/>
+            <wp:cNvGraphicFramePr>
+              <a:graphicFrameLocks xmlns:a="http://schemas.openxmlformats.org/drawingml/2006/main" noChangeAspect="1"/>
+            </wp:cNvGraphicFramePr>
+            <a:graphic xmlns:a="http://schemas.openxmlformats.org/drawingml/2006/main">
+              <a:graphicData uri="http://schemas.openxmlformats.org/drawingml/2006/picture">
+                <pic:pic xmlns:pic="http://schemas.openxmlformats.org/drawingml/2006/picture">
+                  <pic:nvPicPr>
+                    <pic:cNvPr id="0" name="" descr=""/>
+                    <pic:cNvPicPr>
+                      <a:picLocks noChangeAspect="1" noChangeArrowheads="1"/>
+                    </pic:cNvPicPr>
+                  </pic:nvPicPr>
+                  <pic:blipFill>
+                    <a:blip r:embed="rId9" cstate="none"/>
+                    <a:srcRect/>
+                    <a:stretch>
+                      <a:fillRect/>
+                    </a:stretch>
+                  </pic:blipFill>
+                  <pic:spPr bwMode="auto">
+                    <a:xfrm>
+                      <a:off x="0" y="0"/>
+                      <a:ext cx="2295525" cy="1009650"/>
+                    </a:xfrm>
+                    <a:prstGeom prst="rect">
+                      <a:avLst/>
+                    </a:prstGeom>
+                  </pic:spPr>
+                </pic:pic>
+              </a:graphicData>
+            </a:graphic>
+          </wp:inline>
+        </w:drawing>
+      </w:r>
+    </w:p>
     <w:p>
       <w:pPr>
         <w:pStyle w:val="ListParagraph"/>
@@ -16905,6 +17112,7 @@
       <w:tr>
         <w:trPr>
           <w:cantSplit/>
+          <w:tblHeader/>
         </w:trPr>
         <w:tc>
           <w:tcPr>
@@ -17130,6 +17338,7 @@
       <w:tr>
         <w:trPr>
           <w:cantSplit/>
+          <w:tblHeader w:val="false"/>
         </w:trPr>
         <w:tc>
           <w:tcPr>
@@ -17315,6 +17524,7 @@
       <w:tr>
         <w:trPr>
           <w:cantSplit/>
+          <w:tblHeader w:val="false"/>
         </w:trPr>
         <w:tc>
           <w:tcPr>
@@ -17500,6 +17710,7 @@
       <w:tr>
         <w:trPr>
           <w:cantSplit/>
+          <w:tblHeader w:val="false"/>
         </w:trPr>
         <w:tc>
           <w:tcPr>
@@ -18124,6 +18335,7 @@
       <w:tr>
         <w:trPr>
           <w:cantSplit/>
+          <w:tblHeader/>
         </w:trPr>
         <w:tc>
           <w:tcPr>
@@ -18360,6 +18572,7 @@
       <w:tr>
         <w:trPr>
           <w:cantSplit/>
+          <w:tblHeader w:val="false"/>
         </w:trPr>
         <w:tc>
           <w:tcPr>
@@ -21850,6 +22063,7 @@
       <w:tr>
         <w:trPr>
           <w:cantSplit/>
+          <w:tblHeader/>
         </w:trPr>
         <w:tc>
           <w:tcPr>
@@ -21921,6 +22135,7 @@
       <w:tr>
         <w:trPr>
           <w:cantSplit/>
+          <w:tblHeader w:val="false"/>
         </w:trPr>
         <w:tc>
           <w:tcPr>
@@ -21986,6 +22201,7 @@
       <w:tr>
         <w:trPr>
           <w:cantSplit/>
+          <w:tblHeader w:val="false"/>
         </w:trPr>
         <w:tc>
           <w:tcPr>
@@ -22051,6 +22267,7 @@
       <w:tr>
         <w:trPr>
           <w:cantSplit/>
+          <w:tblHeader w:val="false"/>
         </w:trPr>
         <w:tc>
           <w:tcPr>
@@ -22116,6 +22333,7 @@
       <w:tr>
         <w:trPr>
           <w:cantSplit/>
+          <w:tblHeader w:val="false"/>
         </w:trPr>
         <w:tc>
           <w:tcPr>
@@ -22181,6 +22399,7 @@
       <w:tr>
         <w:trPr>
           <w:cantSplit/>
+          <w:tblHeader w:val="false"/>
         </w:trPr>
         <w:tc>
           <w:tcPr>
@@ -22246,6 +22465,7 @@
       <w:tr>
         <w:trPr>
           <w:cantSplit/>
+          <w:tblHeader w:val="false"/>
         </w:trPr>
         <w:tc>
           <w:tcPr>
@@ -22311,6 +22531,7 @@
       <w:tr>
         <w:trPr>
           <w:cantSplit/>
+          <w:tblHeader w:val="false"/>
         </w:trPr>
         <w:tc>
           <w:tcPr>
@@ -22376,6 +22597,7 @@
       <w:tr>
         <w:trPr>
           <w:cantSplit/>
+          <w:tblHeader w:val="false"/>
         </w:trPr>
         <w:tc>
           <w:tcPr>
@@ -22441,6 +22663,7 @@
       <w:tr>
         <w:trPr>
           <w:cantSplit/>
+          <w:tblHeader w:val="false"/>
         </w:trPr>
         <w:tc>
           <w:tcPr>
@@ -22540,6 +22763,7 @@
       <w:tr>
         <w:trPr>
           <w:cantSplit/>
+          <w:tblHeader w:val="false"/>
         </w:trPr>
         <w:tc>
           <w:tcPr>
@@ -22605,6 +22829,7 @@
       <w:tr>
         <w:trPr>
           <w:cantSplit/>
+          <w:tblHeader w:val="false"/>
         </w:trPr>
         <w:tc>
           <w:tcPr>
@@ -23134,6 +23359,7 @@
       <w:tr>
         <w:trPr>
           <w:cantSplit/>
+          <w:tblHeader/>
         </w:trPr>
         <w:tc>
           <w:tcPr>
@@ -23238,6 +23464,7 @@
       <w:tr>
         <w:trPr>
           <w:cantSplit/>
+          <w:tblHeader w:val="false"/>
         </w:trPr>
         <w:tc>
           <w:tcPr>
@@ -23333,6 +23560,7 @@
       <w:tr>
         <w:trPr>
           <w:cantSplit/>
+          <w:tblHeader w:val="false"/>
         </w:trPr>
         <w:tc>
           <w:tcPr>
@@ -23428,6 +23656,7 @@
       <w:tr>
         <w:trPr>
           <w:cantSplit/>
+          <w:tblHeader w:val="false"/>
         </w:trPr>
         <w:tc>
           <w:tcPr>
@@ -23523,6 +23752,7 @@
       <w:tr>
         <w:trPr>
           <w:cantSplit/>
+          <w:tblHeader w:val="false"/>
         </w:trPr>
         <w:tc>
           <w:tcPr>
@@ -23618,6 +23848,7 @@
       <w:tr>
         <w:trPr>
           <w:cantSplit/>
+          <w:tblHeader w:val="false"/>
         </w:trPr>
         <w:tc>
           <w:tcPr>
@@ -23713,6 +23944,7 @@
       <w:tr>
         <w:trPr>
           <w:cantSplit/>
+          <w:tblHeader w:val="false"/>
         </w:trPr>
         <w:tc>
           <w:tcPr>
@@ -23808,6 +24040,7 @@
       <w:tr>
         <w:trPr>
           <w:cantSplit/>
+          <w:tblHeader w:val="false"/>
         </w:trPr>
         <w:tc>
           <w:tcPr>
@@ -23903,6 +24136,7 @@
       <w:tr>
         <w:trPr>
           <w:cantSplit/>
+          <w:tblHeader w:val="false"/>
         </w:trPr>
         <w:tc>
           <w:tcPr>
@@ -23998,6 +24232,7 @@
       <w:tr>
         <w:trPr>
           <w:cantSplit/>
+          <w:tblHeader w:val="false"/>
         </w:trPr>
         <w:tc>
           <w:tcPr>
@@ -24093,6 +24328,7 @@
       <w:tr>
         <w:trPr>
           <w:cantSplit/>
+          <w:tblHeader w:val="false"/>
         </w:trPr>
         <w:tc>
           <w:tcPr>
@@ -24188,6 +24424,7 @@
       <w:tr>
         <w:trPr>
           <w:cantSplit/>
+          <w:tblHeader w:val="false"/>
         </w:trPr>
         <w:tc>
           <w:tcPr>
@@ -24283,6 +24520,7 @@
       <w:tr>
         <w:trPr>
           <w:cantSplit/>
+          <w:tblHeader w:val="false"/>
         </w:trPr>
         <w:tc>
           <w:tcPr>
@@ -24378,6 +24616,7 @@
       <w:tr>
         <w:trPr>
           <w:cantSplit/>
+          <w:tblHeader w:val="false"/>
         </w:trPr>
         <w:tc>
           <w:tcPr>
@@ -24473,6 +24712,7 @@
       <w:tr>
         <w:trPr>
           <w:cantSplit/>
+          <w:tblHeader w:val="false"/>
         </w:trPr>
         <w:tc>
           <w:tcPr>
@@ -24611,6 +24851,7 @@
       <w:tr>
         <w:trPr>
           <w:cantSplit/>
+          <w:tblHeader w:val="false"/>
         </w:trPr>
         <w:tc>
           <w:tcPr>
@@ -24706,6 +24947,7 @@
       <w:tr>
         <w:trPr>
           <w:cantSplit/>
+          <w:tblHeader w:val="false"/>
         </w:trPr>
         <w:tc>
           <w:tcPr>
@@ -24801,6 +25043,7 @@
       <w:tr>
         <w:trPr>
           <w:cantSplit/>
+          <w:tblHeader w:val="false"/>
         </w:trPr>
         <w:tc>
           <w:tcPr>
@@ -24896,6 +25139,7 @@
       <w:tr>
         <w:trPr>
           <w:cantSplit/>
+          <w:tblHeader w:val="false"/>
         </w:trPr>
         <w:tc>
           <w:tcPr>
@@ -24991,6 +25235,7 @@
       <w:tr>
         <w:trPr>
           <w:cantSplit/>
+          <w:tblHeader w:val="false"/>
         </w:trPr>
         <w:tc>
           <w:tcPr>
@@ -25086,6 +25331,7 @@
       <w:tr>
         <w:trPr>
           <w:cantSplit/>
+          <w:tblHeader w:val="false"/>
         </w:trPr>
         <w:tc>
           <w:tcPr>
@@ -25181,6 +25427,7 @@
       <w:tr>
         <w:trPr>
           <w:cantSplit/>
+          <w:tblHeader w:val="false"/>
         </w:trPr>
         <w:tc>
           <w:tcPr>
@@ -25310,6 +25557,7 @@
       <w:tr>
         <w:trPr>
           <w:cantSplit/>
+          <w:tblHeader w:val="false"/>
         </w:trPr>
         <w:tc>
           <w:tcPr>
@@ -25456,6 +25704,7 @@
       <w:tr>
         <w:trPr>
           <w:cantSplit/>
+          <w:tblHeader w:val="false"/>
         </w:trPr>
         <w:tc>
           <w:tcPr>
@@ -25585,6 +25834,7 @@
       <w:tr>
         <w:trPr>
           <w:cantSplit/>
+          <w:tblHeader w:val="false"/>
         </w:trPr>
         <w:tc>
           <w:tcPr>
@@ -25714,6 +25964,7 @@
       <w:tr>
         <w:trPr>
           <w:cantSplit/>
+          <w:tblHeader w:val="false"/>
         </w:trPr>
         <w:tc>
           <w:tcPr>

</xml_diff>

<commit_message>
Typeset cheatsheet formulas as equations and add context to examples
Co-Authored-By: Claude Opus 5.5 <noreply@anthropic.com>
Claude-Session: https://claude.ai/code/session_01SQ1ernijXLTkrk7DHxTTop
</commit_message>
<xml_diff>
--- a/notes/cheatsheet/DOTE2030_Midterm_Cheatsheet.docx
+++ b/notes/cheatsheet/DOTE2030_Midterm_Cheatsheet.docx
@@ -1848,7 +1848,7 @@
           <w:left w:val="single" w:color="1D5FB4" w:sz="12" w:space="2"/>
         </w:pBdr>
         <w:shd w:fill="EEF3FB" w:color="auto" w:val="clear"/>
-        <w:spacing w:after="0" w:before="10" w:line="124" w:lineRule="atLeast"/>
+        <w:spacing w:after="2" w:before="10" w:line="124" w:lineRule="atLeast"/>
         <w:ind w:left="60"/>
       </w:pPr>
       <w:r>
@@ -1859,7 +1859,7 @@
           <w:sz w:val="10"/>
           <w:szCs w:val="10"/>
         </w:rPr>
-        <w:t xml:space="preserve">Flow time of an activity = the shortest time one unit needs to finish that activity</w:t>
+        <w:t xml:space="preserve">Flow time = the SHORTEST time one unit needs (one activity, or START → END)</w:t>
       </w:r>
     </w:p>
     <w:p>
@@ -1868,72 +1868,15 @@
           <w:left w:val="single" w:color="1D5FB4" w:sz="12" w:space="2"/>
         </w:pBdr>
         <w:shd w:fill="EEF3FB" w:color="auto" w:val="clear"/>
-        <w:spacing w:after="0" w:before="0" w:line="124" w:lineRule="atLeast"/>
+        <w:spacing w:after="2" w:before="0" w:line="124" w:lineRule="atLeast"/>
         <w:ind w:left="60"/>
       </w:pPr>
       <w:r>
-        <w:rPr>
-          <w:rFonts w:ascii="Arial" w:cs="Arial" w:eastAsia="Arial" w:hAnsi="Arial"/>
-          <w:b/>
-          <w:bCs/>
-          <w:sz w:val="10"/>
-          <w:szCs w:val="10"/>
-        </w:rPr>
-        <w:t xml:space="preserve">Flow time of the process = the shortest time one unit needs to go START → END</w:t>
-      </w:r>
-    </w:p>
-    <w:p>
-      <w:pPr>
-        <w:pBdr>
-          <w:left w:val="single" w:color="1D5FB4" w:sz="12" w:space="2"/>
-        </w:pBdr>
-        <w:shd w:fill="EEF3FB" w:color="auto" w:val="clear"/>
-        <w:spacing w:after="0" w:before="0" w:line="124" w:lineRule="atLeast"/>
-        <w:ind w:left="60"/>
-      </w:pPr>
-      <w:r>
-        <w:rPr>
-          <w:rFonts w:ascii="Arial" w:cs="Arial" w:eastAsia="Arial" w:hAnsi="Arial"/>
-          <w:b/>
-          <w:bCs/>
-          <w:sz w:val="10"/>
-          <w:szCs w:val="10"/>
-        </w:rPr>
-        <w:t xml:space="preserve">• all activities in one line: ADD all the activity times</w:t>
-      </w:r>
-    </w:p>
-    <w:p>
-      <w:pPr>
-        <w:pBdr>
-          <w:left w:val="single" w:color="1D5FB4" w:sz="12" w:space="2"/>
-        </w:pBdr>
-        <w:shd w:fill="EEF3FB" w:color="auto" w:val="clear"/>
-        <w:spacing w:after="16" w:before="0" w:line="124" w:lineRule="atLeast"/>
-        <w:ind w:left="60"/>
-      </w:pPr>
-      <w:r>
-        <w:rPr>
-          <w:rFonts w:ascii="Arial" w:cs="Arial" w:eastAsia="Arial" w:hAnsi="Arial"/>
-          <w:b/>
-          <w:bCs/>
-          <w:sz w:val="10"/>
-          <w:szCs w:val="10"/>
-        </w:rPr>
-        <w:t xml:space="preserve">• some activities done at the same time (parallel): take the LONGEST path</w:t>
-      </w:r>
-    </w:p>
-    <w:p>
-      <w:pPr>
-        <w:keepLines/>
-        <w:spacing w:after="16" w:before="10"/>
-        <w:jc w:val="center"/>
-      </w:pPr>
-      <w:r>
         <w:drawing>
           <wp:inline distT="0" distB="0" distL="0" distR="0">
-            <wp:extent cx="2295525" cy="571500"/>
+            <wp:extent cx="1543050" cy="123825"/>
             <wp:effectExtent t="0" r="0" b="0" l="0"/>
-            <wp:docPr id="1" name="fig_paths" descr="fig_paths" title="fig_paths"/>
+            <wp:docPr id="1" name="flow1" descr="flow1" title="flow1"/>
             <wp:cNvGraphicFramePr>
               <a:graphicFrameLocks xmlns:a="http://schemas.openxmlformats.org/drawingml/2006/main" noChangeAspect="1"/>
             </wp:cNvGraphicFramePr>
@@ -1956,6 +1899,120 @@
                   <pic:spPr bwMode="auto">
                     <a:xfrm>
                       <a:off x="0" y="0"/>
+                      <a:ext cx="1543050" cy="123825"/>
+                    </a:xfrm>
+                    <a:prstGeom prst="rect">
+                      <a:avLst/>
+                    </a:prstGeom>
+                  </pic:spPr>
+                </pic:pic>
+              </a:graphicData>
+            </a:graphic>
+          </wp:inline>
+        </w:drawing>
+      </w:r>
+    </w:p>
+    <w:p>
+      <w:pPr>
+        <w:pBdr>
+          <w:left w:val="single" w:color="1D5FB4" w:sz="12" w:space="2"/>
+        </w:pBdr>
+        <w:shd w:fill="EEF3FB" w:color="auto" w:val="clear"/>
+        <w:spacing w:after="16" w:before="0" w:line="124" w:lineRule="atLeast"/>
+        <w:ind w:left="60"/>
+      </w:pPr>
+      <w:r>
+        <w:drawing>
+          <wp:inline distT="0" distB="0" distL="0" distR="0">
+            <wp:extent cx="1838325" cy="152400"/>
+            <wp:effectExtent t="0" r="0" b="0" l="0"/>
+            <wp:docPr id="1" name="flow2" descr="flow2" title="flow2"/>
+            <wp:cNvGraphicFramePr>
+              <a:graphicFrameLocks xmlns:a="http://schemas.openxmlformats.org/drawingml/2006/main" noChangeAspect="1"/>
+            </wp:cNvGraphicFramePr>
+            <a:graphic xmlns:a="http://schemas.openxmlformats.org/drawingml/2006/main">
+              <a:graphicData uri="http://schemas.openxmlformats.org/drawingml/2006/picture">
+                <pic:pic xmlns:pic="http://schemas.openxmlformats.org/drawingml/2006/picture">
+                  <pic:nvPicPr>
+                    <pic:cNvPr id="0" name="" descr=""/>
+                    <pic:cNvPicPr>
+                      <a:picLocks noChangeAspect="1" noChangeArrowheads="1"/>
+                    </pic:cNvPicPr>
+                  </pic:nvPicPr>
+                  <pic:blipFill>
+                    <a:blip r:embed="rId8" cstate="none"/>
+                    <a:srcRect/>
+                    <a:stretch>
+                      <a:fillRect/>
+                    </a:stretch>
+                  </pic:blipFill>
+                  <pic:spPr bwMode="auto">
+                    <a:xfrm>
+                      <a:off x="0" y="0"/>
+                      <a:ext cx="1838325" cy="152400"/>
+                    </a:xfrm>
+                    <a:prstGeom prst="rect">
+                      <a:avLst/>
+                    </a:prstGeom>
+                  </pic:spPr>
+                </pic:pic>
+              </a:graphicData>
+            </a:graphic>
+          </wp:inline>
+        </w:drawing>
+      </w:r>
+      <w:r>
+        <w:rPr>
+          <w:sz w:val="10"/>
+          <w:szCs w:val="10"/>
+        </w:rPr>
+        <w:br/>
+        <w:t xml:space="preserve"/>
+      </w:r>
+      <w:r>
+        <w:rPr>
+          <w:rFonts w:ascii="Arial" w:cs="Arial" w:eastAsia="Arial" w:hAnsi="Arial"/>
+          <w:color w:val="444444"/>
+          <w:sz w:val="10"/>
+          <w:szCs w:val="10"/>
+        </w:rPr>
+        <w:t xml:space="preserve">longest route</w:t>
+      </w:r>
+    </w:p>
+    <w:p>
+      <w:pPr>
+        <w:keepLines/>
+        <w:spacing w:after="16" w:before="10"/>
+        <w:jc w:val="center"/>
+      </w:pPr>
+      <w:r>
+        <w:drawing>
+          <wp:inline distT="0" distB="0" distL="0" distR="0">
+            <wp:extent cx="2295525" cy="571500"/>
+            <wp:effectExtent t="0" r="0" b="0" l="0"/>
+            <wp:docPr id="1" name="fig_paths" descr="fig_paths" title="fig_paths"/>
+            <wp:cNvGraphicFramePr>
+              <a:graphicFrameLocks xmlns:a="http://schemas.openxmlformats.org/drawingml/2006/main" noChangeAspect="1"/>
+            </wp:cNvGraphicFramePr>
+            <a:graphic xmlns:a="http://schemas.openxmlformats.org/drawingml/2006/main">
+              <a:graphicData uri="http://schemas.openxmlformats.org/drawingml/2006/picture">
+                <pic:pic xmlns:pic="http://schemas.openxmlformats.org/drawingml/2006/picture">
+                  <pic:nvPicPr>
+                    <pic:cNvPr id="0" name="" descr=""/>
+                    <pic:cNvPicPr>
+                      <a:picLocks noChangeAspect="1" noChangeArrowheads="1"/>
+                    </pic:cNvPicPr>
+                  </pic:nvPicPr>
+                  <pic:blipFill>
+                    <a:blip r:embed="rId9" cstate="none"/>
+                    <a:srcRect/>
+                    <a:stretch>
+                      <a:fillRect/>
+                    </a:stretch>
+                  </pic:blipFill>
+                  <pic:spPr bwMode="auto">
+                    <a:xfrm>
+                      <a:off x="0" y="0"/>
                       <a:ext cx="2295525" cy="571500"/>
                     </a:xfrm>
                     <a:prstGeom prst="rect">
@@ -2339,18 +2396,65 @@
           <w:left w:val="single" w:color="1D5FB4" w:sz="12" w:space="2"/>
         </w:pBdr>
         <w:shd w:fill="EEF3FB" w:color="auto" w:val="clear"/>
-        <w:spacing w:after="0" w:before="10" w:line="124" w:lineRule="atLeast"/>
+        <w:spacing w:after="2" w:before="10" w:line="124" w:lineRule="atLeast"/>
         <w:ind w:left="60"/>
       </w:pPr>
       <w:r>
-        <w:rPr>
-          <w:rFonts w:ascii="Arial" w:cs="Arial" w:eastAsia="Arial" w:hAnsi="Arial"/>
-          <w:b/>
-          <w:bCs/>
-          <w:sz w:val="10"/>
-          <w:szCs w:val="10"/>
-        </w:rPr>
-        <w:t xml:space="preserve">Unit load of a resource = SUM of the times of ALL activities that resource is needed for (min per unit)</w:t>
+        <w:drawing>
+          <wp:inline distT="0" distB="0" distL="0" distR="0">
+            <wp:extent cx="2105025" cy="123825"/>
+            <wp:effectExtent t="0" r="0" b="0" l="0"/>
+            <wp:docPr id="1" name="unitload" descr="unitload" title="unitload"/>
+            <wp:cNvGraphicFramePr>
+              <a:graphicFrameLocks xmlns:a="http://schemas.openxmlformats.org/drawingml/2006/main" noChangeAspect="1"/>
+            </wp:cNvGraphicFramePr>
+            <a:graphic xmlns:a="http://schemas.openxmlformats.org/drawingml/2006/main">
+              <a:graphicData uri="http://schemas.openxmlformats.org/drawingml/2006/picture">
+                <pic:pic xmlns:pic="http://schemas.openxmlformats.org/drawingml/2006/picture">
+                  <pic:nvPicPr>
+                    <pic:cNvPr id="0" name="" descr=""/>
+                    <pic:cNvPicPr>
+                      <a:picLocks noChangeAspect="1" noChangeArrowheads="1"/>
+                    </pic:cNvPicPr>
+                  </pic:nvPicPr>
+                  <pic:blipFill>
+                    <a:blip r:embed="rId10" cstate="none"/>
+                    <a:srcRect/>
+                    <a:stretch>
+                      <a:fillRect/>
+                    </a:stretch>
+                  </pic:blipFill>
+                  <pic:spPr bwMode="auto">
+                    <a:xfrm>
+                      <a:off x="0" y="0"/>
+                      <a:ext cx="2105025" cy="123825"/>
+                    </a:xfrm>
+                    <a:prstGeom prst="rect">
+                      <a:avLst/>
+                    </a:prstGeom>
+                  </pic:spPr>
+                </pic:pic>
+              </a:graphicData>
+            </a:graphic>
+          </wp:inline>
+        </w:drawing>
+      </w:r>
+      <w:r>
+        <w:rPr>
+          <w:sz w:val="10"/>
+          <w:szCs w:val="10"/>
+        </w:rPr>
+        <w:br/>
+        <w:t xml:space="preserve"/>
+      </w:r>
+      <w:r>
+        <w:rPr>
+          <w:rFonts w:ascii="Arial" w:cs="Arial" w:eastAsia="Arial" w:hAnsi="Arial"/>
+          <w:color w:val="444444"/>
+          <w:sz w:val="10"/>
+          <w:szCs w:val="10"/>
+        </w:rPr>
+        <w:t xml:space="preserve">(min per unit)</w:t>
       </w:r>
     </w:p>
     <w:p>
@@ -2359,18 +2463,48 @@
           <w:left w:val="single" w:color="1D5FB4" w:sz="12" w:space="2"/>
         </w:pBdr>
         <w:shd w:fill="EEF3FB" w:color="auto" w:val="clear"/>
-        <w:spacing w:after="0" w:before="0" w:line="124" w:lineRule="atLeast"/>
+        <w:spacing w:after="2" w:before="0" w:line="124" w:lineRule="atLeast"/>
         <w:ind w:left="60"/>
       </w:pPr>
       <w:r>
-        <w:rPr>
-          <w:rFonts w:ascii="Arial" w:cs="Arial" w:eastAsia="Arial" w:hAnsi="Arial"/>
-          <w:b/>
-          <w:bCs/>
-          <w:sz w:val="10"/>
-          <w:szCs w:val="10"/>
-        </w:rPr>
-        <w:t xml:space="preserve">Capacity rate of a resource = 60 ÷ unit load (units/hr)   [or 3600 ÷ unit load in seconds]</w:t>
+        <w:drawing>
+          <wp:inline distT="0" distB="0" distL="0" distR="0">
+            <wp:extent cx="2095500" cy="200025"/>
+            <wp:effectExtent t="0" r="0" b="0" l="0"/>
+            <wp:docPr id="1" name="caprate" descr="caprate" title="caprate"/>
+            <wp:cNvGraphicFramePr>
+              <a:graphicFrameLocks xmlns:a="http://schemas.openxmlformats.org/drawingml/2006/main" noChangeAspect="1"/>
+            </wp:cNvGraphicFramePr>
+            <a:graphic xmlns:a="http://schemas.openxmlformats.org/drawingml/2006/main">
+              <a:graphicData uri="http://schemas.openxmlformats.org/drawingml/2006/picture">
+                <pic:pic xmlns:pic="http://schemas.openxmlformats.org/drawingml/2006/picture">
+                  <pic:nvPicPr>
+                    <pic:cNvPr id="0" name="" descr=""/>
+                    <pic:cNvPicPr>
+                      <a:picLocks noChangeAspect="1" noChangeArrowheads="1"/>
+                    </pic:cNvPicPr>
+                  </pic:nvPicPr>
+                  <pic:blipFill>
+                    <a:blip r:embed="rId11" cstate="none"/>
+                    <a:srcRect/>
+                    <a:stretch>
+                      <a:fillRect/>
+                    </a:stretch>
+                  </pic:blipFill>
+                  <pic:spPr bwMode="auto">
+                    <a:xfrm>
+                      <a:off x="0" y="0"/>
+                      <a:ext cx="2095500" cy="200025"/>
+                    </a:xfrm>
+                    <a:prstGeom prst="rect">
+                      <a:avLst/>
+                    </a:prstGeom>
+                  </pic:spPr>
+                </pic:pic>
+              </a:graphicData>
+            </a:graphic>
+          </wp:inline>
+        </w:drawing>
       </w:r>
     </w:p>
     <w:p>
@@ -2379,18 +2513,48 @@
           <w:left w:val="single" w:color="1D5FB4" w:sz="12" w:space="2"/>
         </w:pBdr>
         <w:shd w:fill="EEF3FB" w:color="auto" w:val="clear"/>
-        <w:spacing w:after="0" w:before="0" w:line="124" w:lineRule="atLeast"/>
+        <w:spacing w:after="2" w:before="0" w:line="124" w:lineRule="atLeast"/>
         <w:ind w:left="60"/>
       </w:pPr>
       <w:r>
-        <w:rPr>
-          <w:rFonts w:ascii="Arial" w:cs="Arial" w:eastAsia="Arial" w:hAnsi="Arial"/>
-          <w:b/>
-          <w:bCs/>
-          <w:sz w:val="10"/>
-          <w:szCs w:val="10"/>
-        </w:rPr>
-        <w:t xml:space="preserve">Capacity rate of a pool of n identical resources = n × capacity of one</w:t>
+        <w:drawing>
+          <wp:inline distT="0" distB="0" distL="0" distR="0">
+            <wp:extent cx="1343025" cy="95250"/>
+            <wp:effectExtent t="0" r="0" b="0" l="0"/>
+            <wp:docPr id="1" name="pool" descr="pool" title="pool"/>
+            <wp:cNvGraphicFramePr>
+              <a:graphicFrameLocks xmlns:a="http://schemas.openxmlformats.org/drawingml/2006/main" noChangeAspect="1"/>
+            </wp:cNvGraphicFramePr>
+            <a:graphic xmlns:a="http://schemas.openxmlformats.org/drawingml/2006/main">
+              <a:graphicData uri="http://schemas.openxmlformats.org/drawingml/2006/picture">
+                <pic:pic xmlns:pic="http://schemas.openxmlformats.org/drawingml/2006/picture">
+                  <pic:nvPicPr>
+                    <pic:cNvPr id="0" name="" descr=""/>
+                    <pic:cNvPicPr>
+                      <a:picLocks noChangeAspect="1" noChangeArrowheads="1"/>
+                    </pic:cNvPicPr>
+                  </pic:nvPicPr>
+                  <pic:blipFill>
+                    <a:blip r:embed="rId12" cstate="none"/>
+                    <a:srcRect/>
+                    <a:stretch>
+                      <a:fillRect/>
+                    </a:stretch>
+                  </pic:blipFill>
+                  <pic:spPr bwMode="auto">
+                    <a:xfrm>
+                      <a:off x="0" y="0"/>
+                      <a:ext cx="1343025" cy="95250"/>
+                    </a:xfrm>
+                    <a:prstGeom prst="rect">
+                      <a:avLst/>
+                    </a:prstGeom>
+                  </pic:spPr>
+                </pic:pic>
+              </a:graphicData>
+            </a:graphic>
+          </wp:inline>
+        </w:drawing>
       </w:r>
     </w:p>
     <w:p>
@@ -2399,18 +2563,65 @@
           <w:left w:val="single" w:color="1D5FB4" w:sz="12" w:space="2"/>
         </w:pBdr>
         <w:shd w:fill="EEF3FB" w:color="auto" w:val="clear"/>
-        <w:spacing w:after="0" w:before="0" w:line="124" w:lineRule="atLeast"/>
+        <w:spacing w:after="2" w:before="0" w:line="124" w:lineRule="atLeast"/>
         <w:ind w:left="60"/>
       </w:pPr>
       <w:r>
-        <w:rPr>
-          <w:rFonts w:ascii="Arial" w:cs="Arial" w:eastAsia="Arial" w:hAnsi="Arial"/>
-          <w:b/>
-          <w:bCs/>
-          <w:sz w:val="10"/>
-          <w:szCs w:val="10"/>
-        </w:rPr>
-        <w:t xml:space="preserve">Process capacity rate = the SMALLEST capacity rate among all resources and pools</w:t>
+        <w:drawing>
+          <wp:inline distT="0" distB="0" distL="0" distR="0">
+            <wp:extent cx="2181225" cy="95250"/>
+            <wp:effectExtent t="0" r="0" b="0" l="0"/>
+            <wp:docPr id="1" name="proc" descr="proc" title="proc"/>
+            <wp:cNvGraphicFramePr>
+              <a:graphicFrameLocks xmlns:a="http://schemas.openxmlformats.org/drawingml/2006/main" noChangeAspect="1"/>
+            </wp:cNvGraphicFramePr>
+            <a:graphic xmlns:a="http://schemas.openxmlformats.org/drawingml/2006/main">
+              <a:graphicData uri="http://schemas.openxmlformats.org/drawingml/2006/picture">
+                <pic:pic xmlns:pic="http://schemas.openxmlformats.org/drawingml/2006/picture">
+                  <pic:nvPicPr>
+                    <pic:cNvPr id="0" name="" descr=""/>
+                    <pic:cNvPicPr>
+                      <a:picLocks noChangeAspect="1" noChangeArrowheads="1"/>
+                    </pic:cNvPicPr>
+                  </pic:nvPicPr>
+                  <pic:blipFill>
+                    <a:blip r:embed="rId13" cstate="none"/>
+                    <a:srcRect/>
+                    <a:stretch>
+                      <a:fillRect/>
+                    </a:stretch>
+                  </pic:blipFill>
+                  <pic:spPr bwMode="auto">
+                    <a:xfrm>
+                      <a:off x="0" y="0"/>
+                      <a:ext cx="2181225" cy="95250"/>
+                    </a:xfrm>
+                    <a:prstGeom prst="rect">
+                      <a:avLst/>
+                    </a:prstGeom>
+                  </pic:spPr>
+                </pic:pic>
+              </a:graphicData>
+            </a:graphic>
+          </wp:inline>
+        </w:drawing>
+      </w:r>
+      <w:r>
+        <w:rPr>
+          <w:sz w:val="10"/>
+          <w:szCs w:val="10"/>
+        </w:rPr>
+        <w:br/>
+        <w:t xml:space="preserve"/>
+      </w:r>
+      <w:r>
+        <w:rPr>
+          <w:rFonts w:ascii="Arial" w:cs="Arial" w:eastAsia="Arial" w:hAnsi="Arial"/>
+          <w:color w:val="444444"/>
+          <w:sz w:val="10"/>
+          <w:szCs w:val="10"/>
+        </w:rPr>
+        <w:t xml:space="preserve">= the bottleneck's capacity</w:t>
       </w:r>
     </w:p>
     <w:p>
@@ -2430,7 +2641,7 @@
           <w:sz w:val="10"/>
           <w:szCs w:val="10"/>
         </w:rPr>
-        <w:t xml:space="preserve">Bottleneck = the resource (or pool) with that smallest capacity rate</w:t>
+        <w:t xml:space="preserve">Bottleneck = the resource (or pool) with the smallest capacity</w:t>
       </w:r>
     </w:p>
     <w:p>
@@ -3305,7 +3516,7 @@
           <w:sz w:val="10"/>
           <w:szCs w:val="10"/>
         </w:rPr>
-        <w:t xml:space="preserve">: oven unit load = load 1 + bake 10 + unload 1 = 12 s ⇒ oven capacity 60/12 = </w:t>
+        <w:t xml:space="preserve">: 2 chefs, 1 oven, 22 s of chef work per pizza. Oven unit load = load 1 + bake 10 + unload 1 = 12 s ⇒ oven capacity 60/12 = </w:t>
       </w:r>
       <w:r>
         <w:rPr>
@@ -3325,7 +3536,7 @@
           <w:sz w:val="10"/>
           <w:szCs w:val="10"/>
         </w:rPr>
-        <w:t xml:space="preserve">. No way of dividing work between chefs can beat 5.</w:t>
+        <w:t xml:space="preserve">. No way of dividing work between the chefs can beat 5.</w:t>
       </w:r>
     </w:p>
     <w:p>
@@ -3372,18 +3583,48 @@
           <w:left w:val="single" w:color="1D5FB4" w:sz="12" w:space="2"/>
         </w:pBdr>
         <w:shd w:fill="EEF3FB" w:color="auto" w:val="clear"/>
-        <w:spacing w:after="0" w:before="10" w:line="124" w:lineRule="atLeast"/>
+        <w:spacing w:after="2" w:before="10" w:line="124" w:lineRule="atLeast"/>
         <w:ind w:left="60"/>
       </w:pPr>
       <w:r>
-        <w:rPr>
-          <w:rFonts w:ascii="Arial" w:cs="Arial" w:eastAsia="Arial" w:hAnsi="Arial"/>
-          <w:b/>
-          <w:bCs/>
-          <w:sz w:val="10"/>
-          <w:szCs w:val="10"/>
-        </w:rPr>
-        <w:t xml:space="preserve">Throughput rate = min{ input (demand) rate , process capacity rate }</w:t>
+        <w:drawing>
+          <wp:inline distT="0" distB="0" distL="0" distR="0">
+            <wp:extent cx="1914525" cy="95250"/>
+            <wp:effectExtent t="0" r="0" b="0" l="0"/>
+            <wp:docPr id="1" name="thru" descr="thru" title="thru"/>
+            <wp:cNvGraphicFramePr>
+              <a:graphicFrameLocks xmlns:a="http://schemas.openxmlformats.org/drawingml/2006/main" noChangeAspect="1"/>
+            </wp:cNvGraphicFramePr>
+            <a:graphic xmlns:a="http://schemas.openxmlformats.org/drawingml/2006/main">
+              <a:graphicData uri="http://schemas.openxmlformats.org/drawingml/2006/picture">
+                <pic:pic xmlns:pic="http://schemas.openxmlformats.org/drawingml/2006/picture">
+                  <pic:nvPicPr>
+                    <pic:cNvPr id="0" name="" descr=""/>
+                    <pic:cNvPicPr>
+                      <a:picLocks noChangeAspect="1" noChangeArrowheads="1"/>
+                    </pic:cNvPicPr>
+                  </pic:nvPicPr>
+                  <pic:blipFill>
+                    <a:blip r:embed="rId14" cstate="none"/>
+                    <a:srcRect/>
+                    <a:stretch>
+                      <a:fillRect/>
+                    </a:stretch>
+                  </pic:blipFill>
+                  <pic:spPr bwMode="auto">
+                    <a:xfrm>
+                      <a:off x="0" y="0"/>
+                      <a:ext cx="1914525" cy="95250"/>
+                    </a:xfrm>
+                    <a:prstGeom prst="rect">
+                      <a:avLst/>
+                    </a:prstGeom>
+                  </pic:spPr>
+                </pic:pic>
+              </a:graphicData>
+            </a:graphic>
+          </wp:inline>
+        </w:drawing>
       </w:r>
     </w:p>
     <w:p>
@@ -3392,18 +3633,57 @@
           <w:left w:val="single" w:color="1D5FB4" w:sz="12" w:space="2"/>
         </w:pBdr>
         <w:shd w:fill="EEF3FB" w:color="auto" w:val="clear"/>
-        <w:spacing w:after="0" w:before="0" w:line="124" w:lineRule="atLeast"/>
+        <w:spacing w:after="2" w:before="0" w:line="124" w:lineRule="atLeast"/>
         <w:ind w:left="60"/>
       </w:pPr>
       <w:r>
-        <w:rPr>
-          <w:rFonts w:ascii="Arial" w:cs="Arial" w:eastAsia="Arial" w:hAnsi="Arial"/>
-          <w:b/>
-          <w:bCs/>
-          <w:sz w:val="10"/>
-          <w:szCs w:val="10"/>
-        </w:rPr>
-        <w:t xml:space="preserve">Utilization of a resource = throughput rate ÷ capacity of that resource   (always ≤ 100%)</w:t>
+        <w:drawing>
+          <wp:inline distT="0" distB="0" distL="0" distR="0">
+            <wp:extent cx="1543050" cy="209550"/>
+            <wp:effectExtent t="0" r="0" b="0" l="0"/>
+            <wp:docPr id="1" name="util" descr="util" title="util"/>
+            <wp:cNvGraphicFramePr>
+              <a:graphicFrameLocks xmlns:a="http://schemas.openxmlformats.org/drawingml/2006/main" noChangeAspect="1"/>
+            </wp:cNvGraphicFramePr>
+            <a:graphic xmlns:a="http://schemas.openxmlformats.org/drawingml/2006/main">
+              <a:graphicData uri="http://schemas.openxmlformats.org/drawingml/2006/picture">
+                <pic:pic xmlns:pic="http://schemas.openxmlformats.org/drawingml/2006/picture">
+                  <pic:nvPicPr>
+                    <pic:cNvPr id="0" name="" descr=""/>
+                    <pic:cNvPicPr>
+                      <a:picLocks noChangeAspect="1" noChangeArrowheads="1"/>
+                    </pic:cNvPicPr>
+                  </pic:nvPicPr>
+                  <pic:blipFill>
+                    <a:blip r:embed="rId15" cstate="none"/>
+                    <a:srcRect/>
+                    <a:stretch>
+                      <a:fillRect/>
+                    </a:stretch>
+                  </pic:blipFill>
+                  <pic:spPr bwMode="auto">
+                    <a:xfrm>
+                      <a:off x="0" y="0"/>
+                      <a:ext cx="1543050" cy="209550"/>
+                    </a:xfrm>
+                    <a:prstGeom prst="rect">
+                      <a:avLst/>
+                    </a:prstGeom>
+                  </pic:spPr>
+                </pic:pic>
+              </a:graphicData>
+            </a:graphic>
+          </wp:inline>
+        </w:drawing>
+      </w:r>
+      <w:r>
+        <w:rPr>
+          <w:rFonts w:ascii="Arial" w:cs="Arial" w:eastAsia="Arial" w:hAnsi="Arial"/>
+          <w:color w:val="444444"/>
+          <w:sz w:val="10"/>
+          <w:szCs w:val="10"/>
+        </w:rPr>
+        <w:t xml:space="preserve">  uses THROUGHPUT</w:t>
       </w:r>
     </w:p>
     <w:p>
@@ -3412,18 +3692,65 @@
           <w:left w:val="single" w:color="1D5FB4" w:sz="12" w:space="2"/>
         </w:pBdr>
         <w:shd w:fill="EEF3FB" w:color="auto" w:val="clear"/>
-        <w:spacing w:after="0" w:before="0" w:line="124" w:lineRule="atLeast"/>
+        <w:spacing w:after="2" w:before="0" w:line="124" w:lineRule="atLeast"/>
         <w:ind w:left="60"/>
       </w:pPr>
       <w:r>
-        <w:rPr>
-          <w:rFonts w:ascii="Arial" w:cs="Arial" w:eastAsia="Arial" w:hAnsi="Arial"/>
-          <w:b/>
-          <w:bCs/>
-          <w:sz w:val="10"/>
-          <w:szCs w:val="10"/>
-        </w:rPr>
-        <w:t xml:space="preserve">Implied utilization of a resource = INPUT rate ÷ capacity of that resource   (can be &gt; 100%)</w:t>
+        <w:drawing>
+          <wp:inline distT="0" distB="0" distL="0" distR="0">
+            <wp:extent cx="2181225" cy="209550"/>
+            <wp:effectExtent t="0" r="0" b="0" l="0"/>
+            <wp:docPr id="1" name="implied" descr="implied" title="implied"/>
+            <wp:cNvGraphicFramePr>
+              <a:graphicFrameLocks xmlns:a="http://schemas.openxmlformats.org/drawingml/2006/main" noChangeAspect="1"/>
+            </wp:cNvGraphicFramePr>
+            <a:graphic xmlns:a="http://schemas.openxmlformats.org/drawingml/2006/main">
+              <a:graphicData uri="http://schemas.openxmlformats.org/drawingml/2006/picture">
+                <pic:pic xmlns:pic="http://schemas.openxmlformats.org/drawingml/2006/picture">
+                  <pic:nvPicPr>
+                    <pic:cNvPr id="0" name="" descr=""/>
+                    <pic:cNvPicPr>
+                      <a:picLocks noChangeAspect="1" noChangeArrowheads="1"/>
+                    </pic:cNvPicPr>
+                  </pic:nvPicPr>
+                  <pic:blipFill>
+                    <a:blip r:embed="rId16" cstate="none"/>
+                    <a:srcRect/>
+                    <a:stretch>
+                      <a:fillRect/>
+                    </a:stretch>
+                  </pic:blipFill>
+                  <pic:spPr bwMode="auto">
+                    <a:xfrm>
+                      <a:off x="0" y="0"/>
+                      <a:ext cx="2181225" cy="209550"/>
+                    </a:xfrm>
+                    <a:prstGeom prst="rect">
+                      <a:avLst/>
+                    </a:prstGeom>
+                  </pic:spPr>
+                </pic:pic>
+              </a:graphicData>
+            </a:graphic>
+          </wp:inline>
+        </w:drawing>
+      </w:r>
+      <w:r>
+        <w:rPr>
+          <w:sz w:val="10"/>
+          <w:szCs w:val="10"/>
+        </w:rPr>
+        <w:br/>
+        <w:t xml:space="preserve"/>
+      </w:r>
+      <w:r>
+        <w:rPr>
+          <w:rFonts w:ascii="Arial" w:cs="Arial" w:eastAsia="Arial" w:hAnsi="Arial"/>
+          <w:color w:val="444444"/>
+          <w:sz w:val="10"/>
+          <w:szCs w:val="10"/>
+        </w:rPr>
+        <w:t xml:space="preserve">uses INPUT</w:t>
       </w:r>
     </w:p>
     <w:p>
@@ -3436,14 +3763,53 @@
         <w:ind w:left="60"/>
       </w:pPr>
       <w:r>
-        <w:rPr>
-          <w:rFonts w:ascii="Arial" w:cs="Arial" w:eastAsia="Arial" w:hAnsi="Arial"/>
-          <w:b/>
-          <w:bCs/>
-          <w:sz w:val="10"/>
-          <w:szCs w:val="10"/>
-        </w:rPr>
-        <w:t xml:space="preserve">Cycle time = 1 ÷ throughput rate = time between two finished units</w:t>
+        <w:drawing>
+          <wp:inline distT="0" distB="0" distL="0" distR="0">
+            <wp:extent cx="952500" cy="209550"/>
+            <wp:effectExtent t="0" r="0" b="0" l="0"/>
+            <wp:docPr id="1" name="cycle" descr="cycle" title="cycle"/>
+            <wp:cNvGraphicFramePr>
+              <a:graphicFrameLocks xmlns:a="http://schemas.openxmlformats.org/drawingml/2006/main" noChangeAspect="1"/>
+            </wp:cNvGraphicFramePr>
+            <a:graphic xmlns:a="http://schemas.openxmlformats.org/drawingml/2006/main">
+              <a:graphicData uri="http://schemas.openxmlformats.org/drawingml/2006/picture">
+                <pic:pic xmlns:pic="http://schemas.openxmlformats.org/drawingml/2006/picture">
+                  <pic:nvPicPr>
+                    <pic:cNvPr id="0" name="" descr=""/>
+                    <pic:cNvPicPr>
+                      <a:picLocks noChangeAspect="1" noChangeArrowheads="1"/>
+                    </pic:cNvPicPr>
+                  </pic:nvPicPr>
+                  <pic:blipFill>
+                    <a:blip r:embed="rId17" cstate="none"/>
+                    <a:srcRect/>
+                    <a:stretch>
+                      <a:fillRect/>
+                    </a:stretch>
+                  </pic:blipFill>
+                  <pic:spPr bwMode="auto">
+                    <a:xfrm>
+                      <a:off x="0" y="0"/>
+                      <a:ext cx="952500" cy="209550"/>
+                    </a:xfrm>
+                    <a:prstGeom prst="rect">
+                      <a:avLst/>
+                    </a:prstGeom>
+                  </pic:spPr>
+                </pic:pic>
+              </a:graphicData>
+            </a:graphic>
+          </wp:inline>
+        </w:drawing>
+      </w:r>
+      <w:r>
+        <w:rPr>
+          <w:rFonts w:ascii="Arial" w:cs="Arial" w:eastAsia="Arial" w:hAnsi="Arial"/>
+          <w:color w:val="444444"/>
+          <w:sz w:val="10"/>
+          <w:szCs w:val="10"/>
+        </w:rPr>
+        <w:t xml:space="preserve">  time between two finished units</w:t>
       </w:r>
     </w:p>
     <w:tbl>
@@ -3826,7 +4192,7 @@
           <w:sz w:val="10"/>
           <w:szCs w:val="10"/>
         </w:rPr>
-        <w:t xml:space="preserve">: pool (W1+W2) 12/hr, W3 60/7 = 8.57/hr, W4 20/hr; input 10/hr.</w:t>
+        <w:t xml:space="preserve">: A (10 min) done by Worker 1 OR Worker 2 (pool 2 × 6 = 12/hr); B 5 + C 2 by Worker 3 (7 min ⇒ 60/7 = 8.57/hr); D 3 min by Worker 4 (20/hr). Input 10/hr.</w:t>
       </w:r>
     </w:p>
     <w:p>
@@ -5118,18 +5484,65 @@
           <w:left w:val="single" w:color="1D5FB4" w:sz="12" w:space="2"/>
         </w:pBdr>
         <w:shd w:fill="EEF3FB" w:color="auto" w:val="clear"/>
-        <w:spacing w:after="0" w:before="10" w:line="124" w:lineRule="atLeast"/>
+        <w:spacing w:after="2" w:before="10" w:line="124" w:lineRule="atLeast"/>
         <w:ind w:left="60"/>
       </w:pPr>
       <w:r>
-        <w:rPr>
-          <w:rFonts w:ascii="Arial" w:cs="Arial" w:eastAsia="Arial" w:hAnsi="Arial"/>
-          <w:b/>
-          <w:bCs/>
-          <w:sz w:val="10"/>
-          <w:szCs w:val="10"/>
-        </w:rPr>
-        <w:t xml:space="preserve">Discrete (table of periods): queue at end of period = max{ 0 , queue at start + input − capacity }</w:t>
+        <w:drawing>
+          <wp:inline distT="0" distB="0" distL="0" distR="0">
+            <wp:extent cx="1581150" cy="95250"/>
+            <wp:effectExtent t="0" r="0" b="0" l="0"/>
+            <wp:docPr id="1" name="qend" descr="qend" title="qend"/>
+            <wp:cNvGraphicFramePr>
+              <a:graphicFrameLocks xmlns:a="http://schemas.openxmlformats.org/drawingml/2006/main" noChangeAspect="1"/>
+            </wp:cNvGraphicFramePr>
+            <a:graphic xmlns:a="http://schemas.openxmlformats.org/drawingml/2006/main">
+              <a:graphicData uri="http://schemas.openxmlformats.org/drawingml/2006/picture">
+                <pic:pic xmlns:pic="http://schemas.openxmlformats.org/drawingml/2006/picture">
+                  <pic:nvPicPr>
+                    <pic:cNvPr id="0" name="" descr=""/>
+                    <pic:cNvPicPr>
+                      <a:picLocks noChangeAspect="1" noChangeArrowheads="1"/>
+                    </pic:cNvPicPr>
+                  </pic:nvPicPr>
+                  <pic:blipFill>
+                    <a:blip r:embed="rId18" cstate="none"/>
+                    <a:srcRect/>
+                    <a:stretch>
+                      <a:fillRect/>
+                    </a:stretch>
+                  </pic:blipFill>
+                  <pic:spPr bwMode="auto">
+                    <a:xfrm>
+                      <a:off x="0" y="0"/>
+                      <a:ext cx="1581150" cy="95250"/>
+                    </a:xfrm>
+                    <a:prstGeom prst="rect">
+                      <a:avLst/>
+                    </a:prstGeom>
+                  </pic:spPr>
+                </pic:pic>
+              </a:graphicData>
+            </a:graphic>
+          </wp:inline>
+        </w:drawing>
+      </w:r>
+      <w:r>
+        <w:rPr>
+          <w:sz w:val="10"/>
+          <w:szCs w:val="10"/>
+        </w:rPr>
+        <w:br/>
+        <w:t xml:space="preserve"/>
+      </w:r>
+      <w:r>
+        <w:rPr>
+          <w:rFonts w:ascii="Arial" w:cs="Arial" w:eastAsia="Arial" w:hAnsi="Arial"/>
+          <w:color w:val="444444"/>
+          <w:sz w:val="10"/>
+          <w:szCs w:val="10"/>
+        </w:rPr>
+        <w:t xml:space="preserve">discrete table, each period</w:t>
       </w:r>
     </w:p>
     <w:p>
@@ -5138,18 +5551,65 @@
           <w:left w:val="single" w:color="1D5FB4" w:sz="12" w:space="2"/>
         </w:pBdr>
         <w:shd w:fill="EEF3FB" w:color="auto" w:val="clear"/>
-        <w:spacing w:after="0" w:before="0" w:line="124" w:lineRule="atLeast"/>
+        <w:spacing w:after="2" w:before="0" w:line="124" w:lineRule="atLeast"/>
         <w:ind w:left="60"/>
       </w:pPr>
       <w:r>
-        <w:rPr>
-          <w:rFonts w:ascii="Arial" w:cs="Arial" w:eastAsia="Arial" w:hAnsi="Arial"/>
-          <w:b/>
-          <w:bCs/>
-          <w:sz w:val="10"/>
-          <w:szCs w:val="10"/>
-        </w:rPr>
-        <w:t xml:space="preserve">Continuous (graph): slope = input rate − capacity rate (while a queue exists)</w:t>
+        <w:drawing>
+          <wp:inline distT="0" distB="0" distL="0" distR="0">
+            <wp:extent cx="2038350" cy="95250"/>
+            <wp:effectExtent t="0" r="0" b="0" l="0"/>
+            <wp:docPr id="1" name="slope" descr="slope" title="slope"/>
+            <wp:cNvGraphicFramePr>
+              <a:graphicFrameLocks xmlns:a="http://schemas.openxmlformats.org/drawingml/2006/main" noChangeAspect="1"/>
+            </wp:cNvGraphicFramePr>
+            <a:graphic xmlns:a="http://schemas.openxmlformats.org/drawingml/2006/main">
+              <a:graphicData uri="http://schemas.openxmlformats.org/drawingml/2006/picture">
+                <pic:pic xmlns:pic="http://schemas.openxmlformats.org/drawingml/2006/picture">
+                  <pic:nvPicPr>
+                    <pic:cNvPr id="0" name="" descr=""/>
+                    <pic:cNvPicPr>
+                      <a:picLocks noChangeAspect="1" noChangeArrowheads="1"/>
+                    </pic:cNvPicPr>
+                  </pic:nvPicPr>
+                  <pic:blipFill>
+                    <a:blip r:embed="rId19" cstate="none"/>
+                    <a:srcRect/>
+                    <a:stretch>
+                      <a:fillRect/>
+                    </a:stretch>
+                  </pic:blipFill>
+                  <pic:spPr bwMode="auto">
+                    <a:xfrm>
+                      <a:off x="0" y="0"/>
+                      <a:ext cx="2038350" cy="95250"/>
+                    </a:xfrm>
+                    <a:prstGeom prst="rect">
+                      <a:avLst/>
+                    </a:prstGeom>
+                  </pic:spPr>
+                </pic:pic>
+              </a:graphicData>
+            </a:graphic>
+          </wp:inline>
+        </w:drawing>
+      </w:r>
+      <w:r>
+        <w:rPr>
+          <w:sz w:val="10"/>
+          <w:szCs w:val="10"/>
+        </w:rPr>
+        <w:br/>
+        <w:t xml:space="preserve"/>
+      </w:r>
+      <w:r>
+        <w:rPr>
+          <w:rFonts w:ascii="Arial" w:cs="Arial" w:eastAsia="Arial" w:hAnsi="Arial"/>
+          <w:color w:val="444444"/>
+          <w:sz w:val="10"/>
+          <w:szCs w:val="10"/>
+        </w:rPr>
+        <w:t xml:space="preserve">continuous graph</w:t>
       </w:r>
     </w:p>
     <w:p>
@@ -5158,18 +5618,48 @@
           <w:left w:val="single" w:color="1D5FB4" w:sz="12" w:space="2"/>
         </w:pBdr>
         <w:shd w:fill="EEF3FB" w:color="auto" w:val="clear"/>
-        <w:spacing w:after="0" w:before="0" w:line="124" w:lineRule="atLeast"/>
+        <w:spacing w:after="2" w:before="0" w:line="124" w:lineRule="atLeast"/>
         <w:ind w:left="60"/>
       </w:pPr>
       <w:r>
-        <w:rPr>
-          <w:rFonts w:ascii="Arial" w:cs="Arial" w:eastAsia="Arial" w:hAnsi="Arial"/>
-          <w:b/>
-          <w:bCs/>
-          <w:sz w:val="10"/>
-          <w:szCs w:val="10"/>
-        </w:rPr>
-        <w:t xml:space="preserve">Time for a queue to empty = queue size ÷ (capacity − input)</w:t>
+        <w:drawing>
+          <wp:inline distT="0" distB="0" distL="0" distR="0">
+            <wp:extent cx="1295400" cy="209550"/>
+            <wp:effectExtent t="0" r="0" b="0" l="0"/>
+            <wp:docPr id="1" name="empty" descr="empty" title="empty"/>
+            <wp:cNvGraphicFramePr>
+              <a:graphicFrameLocks xmlns:a="http://schemas.openxmlformats.org/drawingml/2006/main" noChangeAspect="1"/>
+            </wp:cNvGraphicFramePr>
+            <a:graphic xmlns:a="http://schemas.openxmlformats.org/drawingml/2006/main">
+              <a:graphicData uri="http://schemas.openxmlformats.org/drawingml/2006/picture">
+                <pic:pic xmlns:pic="http://schemas.openxmlformats.org/drawingml/2006/picture">
+                  <pic:nvPicPr>
+                    <pic:cNvPr id="0" name="" descr=""/>
+                    <pic:cNvPicPr>
+                      <a:picLocks noChangeAspect="1" noChangeArrowheads="1"/>
+                    </pic:cNvPicPr>
+                  </pic:nvPicPr>
+                  <pic:blipFill>
+                    <a:blip r:embed="rId20" cstate="none"/>
+                    <a:srcRect/>
+                    <a:stretch>
+                      <a:fillRect/>
+                    </a:stretch>
+                  </pic:blipFill>
+                  <pic:spPr bwMode="auto">
+                    <a:xfrm>
+                      <a:off x="0" y="0"/>
+                      <a:ext cx="1295400" cy="209550"/>
+                    </a:xfrm>
+                    <a:prstGeom prst="rect">
+                      <a:avLst/>
+                    </a:prstGeom>
+                  </pic:spPr>
+                </pic:pic>
+              </a:graphicData>
+            </a:graphic>
+          </wp:inline>
+        </w:drawing>
       </w:r>
     </w:p>
     <w:p>
@@ -5178,18 +5668,48 @@
           <w:left w:val="single" w:color="1D5FB4" w:sz="12" w:space="2"/>
         </w:pBdr>
         <w:shd w:fill="EEF3FB" w:color="auto" w:val="clear"/>
-        <w:spacing w:after="0" w:before="0" w:line="124" w:lineRule="atLeast"/>
+        <w:spacing w:after="2" w:before="0" w:line="124" w:lineRule="atLeast"/>
         <w:ind w:left="60"/>
       </w:pPr>
       <w:r>
-        <w:rPr>
-          <w:rFonts w:ascii="Arial" w:cs="Arial" w:eastAsia="Arial" w:hAnsi="Arial"/>
-          <w:b/>
-          <w:bCs/>
-          <w:sz w:val="10"/>
-          <w:szCs w:val="10"/>
-        </w:rPr>
-        <w:t xml:space="preserve">Discrete average = sum of end-of-period queues ÷ number of periods</w:t>
+        <w:drawing>
+          <wp:inline distT="0" distB="0" distL="0" distR="0">
+            <wp:extent cx="1685925" cy="228600"/>
+            <wp:effectExtent t="0" r="0" b="0" l="0"/>
+            <wp:docPr id="1" name="davg" descr="davg" title="davg"/>
+            <wp:cNvGraphicFramePr>
+              <a:graphicFrameLocks xmlns:a="http://schemas.openxmlformats.org/drawingml/2006/main" noChangeAspect="1"/>
+            </wp:cNvGraphicFramePr>
+            <a:graphic xmlns:a="http://schemas.openxmlformats.org/drawingml/2006/main">
+              <a:graphicData uri="http://schemas.openxmlformats.org/drawingml/2006/picture">
+                <pic:pic xmlns:pic="http://schemas.openxmlformats.org/drawingml/2006/picture">
+                  <pic:nvPicPr>
+                    <pic:cNvPr id="0" name="" descr=""/>
+                    <pic:cNvPicPr>
+                      <a:picLocks noChangeAspect="1" noChangeArrowheads="1"/>
+                    </pic:cNvPicPr>
+                  </pic:nvPicPr>
+                  <pic:blipFill>
+                    <a:blip r:embed="rId21" cstate="none"/>
+                    <a:srcRect/>
+                    <a:stretch>
+                      <a:fillRect/>
+                    </a:stretch>
+                  </pic:blipFill>
+                  <pic:spPr bwMode="auto">
+                    <a:xfrm>
+                      <a:off x="0" y="0"/>
+                      <a:ext cx="1685925" cy="228600"/>
+                    </a:xfrm>
+                    <a:prstGeom prst="rect">
+                      <a:avLst/>
+                    </a:prstGeom>
+                  </pic:spPr>
+                </pic:pic>
+              </a:graphicData>
+            </a:graphic>
+          </wp:inline>
+        </w:drawing>
       </w:r>
     </w:p>
     <w:p>
@@ -5202,14 +5722,61 @@
         <w:ind w:left="60"/>
       </w:pPr>
       <w:r>
-        <w:rPr>
-          <w:rFonts w:ascii="Arial" w:cs="Arial" w:eastAsia="Arial" w:hAnsi="Arial"/>
-          <w:b/>
-          <w:bCs/>
-          <w:sz w:val="10"/>
-          <w:szCs w:val="10"/>
-        </w:rPr>
-        <w:t xml:space="preserve">Continuous average = area under the graph ÷ total length of time</w:t>
+        <w:drawing>
+          <wp:inline distT="0" distB="0" distL="0" distR="0">
+            <wp:extent cx="1562100" cy="200025"/>
+            <wp:effectExtent t="0" r="0" b="0" l="0"/>
+            <wp:docPr id="1" name="cavg" descr="cavg" title="cavg"/>
+            <wp:cNvGraphicFramePr>
+              <a:graphicFrameLocks xmlns:a="http://schemas.openxmlformats.org/drawingml/2006/main" noChangeAspect="1"/>
+            </wp:cNvGraphicFramePr>
+            <a:graphic xmlns:a="http://schemas.openxmlformats.org/drawingml/2006/main">
+              <a:graphicData uri="http://schemas.openxmlformats.org/drawingml/2006/picture">
+                <pic:pic xmlns:pic="http://schemas.openxmlformats.org/drawingml/2006/picture">
+                  <pic:nvPicPr>
+                    <pic:cNvPr id="0" name="" descr=""/>
+                    <pic:cNvPicPr>
+                      <a:picLocks noChangeAspect="1" noChangeArrowheads="1"/>
+                    </pic:cNvPicPr>
+                  </pic:nvPicPr>
+                  <pic:blipFill>
+                    <a:blip r:embed="rId22" cstate="none"/>
+                    <a:srcRect/>
+                    <a:stretch>
+                      <a:fillRect/>
+                    </a:stretch>
+                  </pic:blipFill>
+                  <pic:spPr bwMode="auto">
+                    <a:xfrm>
+                      <a:off x="0" y="0"/>
+                      <a:ext cx="1562100" cy="200025"/>
+                    </a:xfrm>
+                    <a:prstGeom prst="rect">
+                      <a:avLst/>
+                    </a:prstGeom>
+                  </pic:spPr>
+                </pic:pic>
+              </a:graphicData>
+            </a:graphic>
+          </wp:inline>
+        </w:drawing>
+      </w:r>
+      <w:r>
+        <w:rPr>
+          <w:sz w:val="10"/>
+          <w:szCs w:val="10"/>
+        </w:rPr>
+        <w:br/>
+        <w:t xml:space="preserve"/>
+      </w:r>
+      <w:r>
+        <w:rPr>
+          <w:rFonts w:ascii="Arial" w:cs="Arial" w:eastAsia="Arial" w:hAnsi="Arial"/>
+          <w:color w:val="444444"/>
+          <w:sz w:val="10"/>
+          <w:szCs w:val="10"/>
+        </w:rPr>
+        <w:t xml:space="preserve">include zero stretches</w:t>
       </w:r>
     </w:p>
     <w:p>
@@ -5311,7 +5878,7 @@
                     </pic:cNvPicPr>
                   </pic:nvPicPr>
                   <pic:blipFill>
-                    <a:blip r:embed="rId8" cstate="none"/>
+                    <a:blip r:embed="rId23" cstate="none"/>
                     <a:srcRect/>
                     <a:stretch>
                       <a:fillRect/>
@@ -5660,17 +6227,17 @@
           <w:sz w:val="10"/>
           <w:szCs w:val="10"/>
         </w:rPr>
-        <w:t xml:space="preserve">SA12(a) weekly tank</w:t>
-      </w:r>
-      <w:r>
-        <w:rPr>
-          <w:rFonts w:ascii="Arial" w:cs="Arial" w:eastAsia="Arial" w:hAnsi="Arial"/>
-          <w:b w:val="false"/>
-          <w:bCs w:val="false"/>
-          <w:sz w:val="10"/>
-          <w:szCs w:val="10"/>
-        </w:rPr>
-        <w:t xml:space="preserve">: areas A 37.5 + B 75 + C 50 + D 50 + E 37.5 = 250 ⇒ 250 ÷ 7 days = </w:t>
+        <w:t xml:space="preserve">SA12(a) weekly tank (graph given)</w:t>
+      </w:r>
+      <w:r>
+        <w:rPr>
+          <w:rFonts w:ascii="Arial" w:cs="Arial" w:eastAsia="Arial" w:hAnsi="Arial"/>
+          <w:b w:val="false"/>
+          <w:bCs w:val="false"/>
+          <w:sz w:val="10"/>
+          <w:szCs w:val="10"/>
+        </w:rPr>
+        <w:t xml:space="preserve">: tons in tank rise 0 (Sun) → 25 (Wed), then 25 → 75 (Fri), stay 75 until Sat, fall to 0 (next Sun). Areas: triangle ½·3·25 = 37.5; rectangle under 25 Wed–Sat 3·25 = 75; triangle ½·2·50 = 50; rectangle Fri–Sat 1·50 = 50; triangle Sat–Sun ½·1·75 = 37.5. Total 250 ⇒ 250 ÷ 7 days = </w:t>
       </w:r>
       <w:r>
         <w:rPr>
@@ -5710,17 +6277,17 @@
           <w:sz w:val="10"/>
           <w:szCs w:val="10"/>
         </w:rPr>
-        <w:t xml:space="preserve">Airport (discrete)</w:t>
-      </w:r>
-      <w:r>
-        <w:rPr>
-          <w:rFonts w:ascii="Arial" w:cs="Arial" w:eastAsia="Arial" w:hAnsi="Arial"/>
-          <w:b w:val="false"/>
-          <w:bCs w:val="false"/>
-          <w:sz w:val="10"/>
-          <w:szCs w:val="10"/>
-        </w:rPr>
-        <w:t xml:space="preserve">: capacity 15 per 15 min; total demand 195 &lt; capacity 240 but queues of 1, 4, 11, 13, 11, 7, 4 appear ⇒ 51 ÷ 16 = </w:t>
+        <w:t xml:space="preserve">Airport (discrete, L3)</w:t>
+      </w:r>
+      <w:r>
+        <w:rPr>
+          <w:rFonts w:ascii="Arial" w:cs="Arial" w:eastAsia="Arial" w:hAnsi="Arial"/>
+          <w:b w:val="false"/>
+          <w:bCs w:val="false"/>
+          <w:sz w:val="10"/>
+          <w:szCs w:val="10"/>
+        </w:rPr>
+        <w:t xml:space="preserve">: security can screen 15 passengers per 15-min slot, 6–10 am (16 slots). Arrivals per slot: 7, 10, 8, 12, 9, 16, 14, 19, 22, 17, 13, 11, 12, 8, 10, 7 (total 195 &lt; capacity 240). Queue rule max(0, prev + arrivals − 15) gives 0,0,0,0,0, 1, 0, 4, 11, 13, 11, 7, 4, 0,0,0 ⇒ average 51 ÷ 16 = </w:t>
       </w:r>
       <w:r>
         <w:rPr>
@@ -5740,7 +6307,7 @@
           <w:sz w:val="10"/>
           <w:szCs w:val="10"/>
         </w:rPr>
-        <w:t xml:space="preserve">. Enough total capacity does not mean no queue.</w:t>
+        <w:t xml:space="preserve">. Enough TOTAL capacity still gives queues when some slots exceed 15.</w:t>
       </w:r>
     </w:p>
     <w:p>
@@ -5760,17 +6327,57 @@
           <w:sz w:val="10"/>
           <w:szCs w:val="10"/>
         </w:rPr>
-        <w:t xml:space="preserve">Same data, two methods</w:t>
-      </w:r>
-      <w:r>
-        <w:rPr>
-          <w:rFonts w:ascii="Arial" w:cs="Arial" w:eastAsia="Arial" w:hAnsi="Arial"/>
-          <w:b w:val="false"/>
-          <w:bCs w:val="false"/>
-          <w:sz w:val="10"/>
-          <w:szCs w:val="10"/>
-        </w:rPr>
-        <w:t xml:space="preserve">: +20 in week 1, +30 in week 2. Discrete (end of week 20, 50): (20 + 50)/2 = 35. Continuous: (10 + 20 + 15)/2 = 22.5.</w:t>
+        <w:t xml:space="preserve">Same data, two methods (L3 summary)</w:t>
+      </w:r>
+      <w:r>
+        <w:rPr>
+          <w:rFonts w:ascii="Arial" w:cs="Arial" w:eastAsia="Arial" w:hAnsi="Arial"/>
+          <w:b w:val="false"/>
+          <w:bCs w:val="false"/>
+          <w:sz w:val="10"/>
+          <w:szCs w:val="10"/>
+        </w:rPr>
+        <w:t xml:space="preserve">: inventory starts at 0, rises steadily to 20 by end of week 1, then to 50 by end of week 2. Discrete (only end-of-week values 20 and 50): (20 + 50) ÷ 2 = </w:t>
+      </w:r>
+      <w:r>
+        <w:rPr>
+          <w:rFonts w:ascii="Arial" w:cs="Arial" w:eastAsia="Arial" w:hAnsi="Arial"/>
+          <w:b/>
+          <w:bCs/>
+          <w:sz w:val="10"/>
+          <w:szCs w:val="10"/>
+        </w:rPr>
+        <w:t xml:space="preserve">35</w:t>
+      </w:r>
+      <w:r>
+        <w:rPr>
+          <w:rFonts w:ascii="Arial" w:cs="Arial" w:eastAsia="Arial" w:hAnsi="Arial"/>
+          <w:b w:val="false"/>
+          <w:bCs w:val="false"/>
+          <w:sz w:val="10"/>
+          <w:szCs w:val="10"/>
+        </w:rPr>
+        <w:t xml:space="preserve">. Continuous (area under the rising line): week 1 triangle ½·1·20 = 10; week 2 rectangle 1·20 = 20 + triangle ½·1·30 = 15 ⇒ 45 ÷ 2 = </w:t>
+      </w:r>
+      <w:r>
+        <w:rPr>
+          <w:rFonts w:ascii="Arial" w:cs="Arial" w:eastAsia="Arial" w:hAnsi="Arial"/>
+          <w:b/>
+          <w:bCs/>
+          <w:sz w:val="10"/>
+          <w:szCs w:val="10"/>
+        </w:rPr>
+        <w:t xml:space="preserve">22.5</w:t>
+      </w:r>
+      <w:r>
+        <w:rPr>
+          <w:rFonts w:ascii="Arial" w:cs="Arial" w:eastAsia="Arial" w:hAnsi="Arial"/>
+          <w:b w:val="false"/>
+          <w:bCs w:val="false"/>
+          <w:sz w:val="10"/>
+          <w:szCs w:val="10"/>
+        </w:rPr>
+        <w:t xml:space="preserve">. Use the method the question names.</w:t>
       </w:r>
     </w:p>
     <w:p>
@@ -5887,38 +6494,65 @@
           <w:left w:val="single" w:color="1D5FB4" w:sz="12" w:space="2"/>
         </w:pBdr>
         <w:shd w:fill="EEF3FB" w:color="auto" w:val="clear"/>
-        <w:spacing w:after="0" w:before="10" w:line="124" w:lineRule="atLeast"/>
+        <w:spacing w:after="16" w:before="10" w:line="124" w:lineRule="atLeast"/>
         <w:ind w:left="60"/>
       </w:pPr>
       <w:r>
-        <w:rPr>
-          <w:rFonts w:ascii="Arial" w:cs="Arial" w:eastAsia="Arial" w:hAnsi="Arial"/>
-          <w:b/>
-          <w:bCs/>
-          <w:sz w:val="10"/>
-          <w:szCs w:val="10"/>
-        </w:rPr>
-        <w:t xml:space="preserve">I = R × T      (average inventory = average throughput rate × average flow time)</w:t>
-      </w:r>
-    </w:p>
-    <w:p>
-      <w:pPr>
-        <w:pBdr>
-          <w:left w:val="single" w:color="1D5FB4" w:sz="12" w:space="2"/>
-        </w:pBdr>
-        <w:shd w:fill="EEF3FB" w:color="auto" w:val="clear"/>
-        <w:spacing w:after="16" w:before="0" w:line="124" w:lineRule="atLeast"/>
-        <w:ind w:left="60"/>
-      </w:pPr>
-      <w:r>
-        <w:rPr>
-          <w:rFonts w:ascii="Arial" w:cs="Arial" w:eastAsia="Arial" w:hAnsi="Arial"/>
-          <w:b/>
-          <w:bCs/>
-          <w:sz w:val="10"/>
-          <w:szCs w:val="10"/>
-        </w:rPr>
-        <w:t xml:space="preserve">rearranged:  R = I ÷ T     T = I ÷ R</w:t>
+        <w:drawing>
+          <wp:inline distT="0" distB="0" distL="0" distR="0">
+            <wp:extent cx="1028700" cy="190500"/>
+            <wp:effectExtent t="0" r="0" b="0" l="0"/>
+            <wp:docPr id="1" name="little" descr="little" title="little"/>
+            <wp:cNvGraphicFramePr>
+              <a:graphicFrameLocks xmlns:a="http://schemas.openxmlformats.org/drawingml/2006/main" noChangeAspect="1"/>
+            </wp:cNvGraphicFramePr>
+            <a:graphic xmlns:a="http://schemas.openxmlformats.org/drawingml/2006/main">
+              <a:graphicData uri="http://schemas.openxmlformats.org/drawingml/2006/picture">
+                <pic:pic xmlns:pic="http://schemas.openxmlformats.org/drawingml/2006/picture">
+                  <pic:nvPicPr>
+                    <pic:cNvPr id="0" name="" descr=""/>
+                    <pic:cNvPicPr>
+                      <a:picLocks noChangeAspect="1" noChangeArrowheads="1"/>
+                    </pic:cNvPicPr>
+                  </pic:nvPicPr>
+                  <pic:blipFill>
+                    <a:blip r:embed="rId24" cstate="none"/>
+                    <a:srcRect/>
+                    <a:stretch>
+                      <a:fillRect/>
+                    </a:stretch>
+                  </pic:blipFill>
+                  <pic:spPr bwMode="auto">
+                    <a:xfrm>
+                      <a:off x="0" y="0"/>
+                      <a:ext cx="1028700" cy="190500"/>
+                    </a:xfrm>
+                    <a:prstGeom prst="rect">
+                      <a:avLst/>
+                    </a:prstGeom>
+                  </pic:spPr>
+                </pic:pic>
+              </a:graphicData>
+            </a:graphic>
+          </wp:inline>
+        </w:drawing>
+      </w:r>
+      <w:r>
+        <w:rPr>
+          <w:sz w:val="10"/>
+          <w:szCs w:val="10"/>
+        </w:rPr>
+        <w:br/>
+        <w:t xml:space="preserve"/>
+      </w:r>
+      <w:r>
+        <w:rPr>
+          <w:rFonts w:ascii="Arial" w:cs="Arial" w:eastAsia="Arial" w:hAnsi="Arial"/>
+          <w:color w:val="444444"/>
+          <w:sz w:val="10"/>
+          <w:szCs w:val="10"/>
+        </w:rPr>
+        <w:t xml:space="preserve">I = avg inventory, R = throughput, T = flow time</w:t>
       </w:r>
     </w:p>
     <w:p>
@@ -6316,17 +6950,17 @@
           <w:sz w:val="10"/>
           <w:szCs w:val="10"/>
         </w:rPr>
-        <w:t xml:space="preserve">Queue waiting time</w:t>
-      </w:r>
-      <w:r>
-        <w:rPr>
-          <w:rFonts w:ascii="Arial" w:cs="Arial" w:eastAsia="Arial" w:hAnsi="Arial"/>
-          <w:b w:val="false"/>
-          <w:bCs w:val="false"/>
-          <w:sz w:val="10"/>
-          <w:szCs w:val="10"/>
-        </w:rPr>
-        <w:t xml:space="preserve">: average queue 75, R = 87.5/hr ⇒ T</w:t>
+        <w:t xml:space="preserve">Queue waiting time (same 10 am–6 pm lecture example)</w:t>
+      </w:r>
+      <w:r>
+        <w:rPr>
+          <w:rFonts w:ascii="Arial" w:cs="Arial" w:eastAsia="Arial" w:hAnsi="Arial"/>
+          <w:b w:val="false"/>
+          <w:bCs w:val="false"/>
+          <w:sz w:val="10"/>
+          <w:szCs w:val="10"/>
+        </w:rPr>
+        <w:t xml:space="preserve">: average queue I</w:t>
       </w:r>
       <w:r>
         <w:rPr>
@@ -6347,7 +6981,28 @@
           <w:sz w:val="10"/>
           <w:szCs w:val="10"/>
         </w:rPr>
-        <w:t xml:space="preserve"> = 75 ÷ 87.5 hr = </w:t>
+        <w:t xml:space="preserve"> = 75 people, throughput R = 700 served ÷ 8 hr = 87.5/hr ⇒ T</w:t>
+      </w:r>
+      <w:r>
+        <w:rPr>
+          <w:rFonts w:ascii="Arial" w:cs="Arial" w:eastAsia="Arial" w:hAnsi="Arial"/>
+          <w:b w:val="false"/>
+          <w:bCs w:val="false"/>
+          <w:sz w:val="10"/>
+          <w:szCs w:val="10"/>
+          <w:vertAlign w:val="subscript"/>
+        </w:rPr>
+        <w:t xml:space="preserve">q</w:t>
+      </w:r>
+      <w:r>
+        <w:rPr>
+          <w:rFonts w:ascii="Arial" w:cs="Arial" w:eastAsia="Arial" w:hAnsi="Arial"/>
+          <w:b w:val="false"/>
+          <w:bCs w:val="false"/>
+          <w:sz w:val="10"/>
+          <w:szCs w:val="10"/>
+        </w:rPr>
+        <w:t xml:space="preserve"> = 75 ÷ 87.5 = 0.857 hr = </w:t>
       </w:r>
       <w:r>
         <w:rPr>
@@ -8024,71 +8679,65 @@
           <w:left w:val="single" w:color="1D5FB4" w:sz="12" w:space="2"/>
         </w:pBdr>
         <w:shd w:fill="EEF3FB" w:color="auto" w:val="clear"/>
-        <w:spacing w:after="0" w:before="10" w:line="124" w:lineRule="atLeast"/>
+        <w:spacing w:after="2" w:before="10" w:line="124" w:lineRule="atLeast"/>
         <w:ind w:left="60"/>
       </w:pPr>
       <w:r>
-        <w:rPr>
-          <w:rFonts w:ascii="Arial" w:cs="Arial" w:eastAsia="Arial" w:hAnsi="Arial"/>
-          <w:b/>
-          <w:bCs/>
-          <w:sz w:val="10"/>
-          <w:szCs w:val="10"/>
-        </w:rPr>
-        <w:t xml:space="preserve">Completion time = waiting time + own processing time:  C</w:t>
-      </w:r>
-      <w:r>
-        <w:rPr>
-          <w:rFonts w:ascii="Arial" w:cs="Arial" w:eastAsia="Arial" w:hAnsi="Arial"/>
-          <w:b/>
-          <w:bCs/>
-          <w:sz w:val="10"/>
-          <w:szCs w:val="10"/>
-          <w:vertAlign w:val="subscript"/>
-        </w:rPr>
-        <w:t xml:space="preserve">i</w:t>
-      </w:r>
-      <w:r>
-        <w:rPr>
-          <w:rFonts w:ascii="Arial" w:cs="Arial" w:eastAsia="Arial" w:hAnsi="Arial"/>
-          <w:b/>
-          <w:bCs/>
-          <w:sz w:val="10"/>
-          <w:szCs w:val="10"/>
-        </w:rPr>
-        <w:t xml:space="preserve"> = W</w:t>
-      </w:r>
-      <w:r>
-        <w:rPr>
-          <w:rFonts w:ascii="Arial" w:cs="Arial" w:eastAsia="Arial" w:hAnsi="Arial"/>
-          <w:b/>
-          <w:bCs/>
-          <w:sz w:val="10"/>
-          <w:szCs w:val="10"/>
-          <w:vertAlign w:val="subscript"/>
-        </w:rPr>
-        <w:t xml:space="preserve">i</w:t>
-      </w:r>
-      <w:r>
-        <w:rPr>
-          <w:rFonts w:ascii="Arial" w:cs="Arial" w:eastAsia="Arial" w:hAnsi="Arial"/>
-          <w:b/>
-          <w:bCs/>
-          <w:sz w:val="10"/>
-          <w:szCs w:val="10"/>
-        </w:rPr>
-        <w:t xml:space="preserve"> + p</w:t>
-      </w:r>
-      <w:r>
-        <w:rPr>
-          <w:rFonts w:ascii="Arial" w:cs="Arial" w:eastAsia="Arial" w:hAnsi="Arial"/>
-          <w:b/>
-          <w:bCs/>
-          <w:sz w:val="10"/>
-          <w:szCs w:val="10"/>
-          <w:vertAlign w:val="subscript"/>
-        </w:rPr>
-        <w:t xml:space="preserve">i</w:t>
+        <w:drawing>
+          <wp:inline distT="0" distB="0" distL="0" distR="0">
+            <wp:extent cx="1219200" cy="123825"/>
+            <wp:effectExtent t="0" r="0" b="0" l="0"/>
+            <wp:docPr id="1" name="comp" descr="comp" title="comp"/>
+            <wp:cNvGraphicFramePr>
+              <a:graphicFrameLocks xmlns:a="http://schemas.openxmlformats.org/drawingml/2006/main" noChangeAspect="1"/>
+            </wp:cNvGraphicFramePr>
+            <a:graphic xmlns:a="http://schemas.openxmlformats.org/drawingml/2006/main">
+              <a:graphicData uri="http://schemas.openxmlformats.org/drawingml/2006/picture">
+                <pic:pic xmlns:pic="http://schemas.openxmlformats.org/drawingml/2006/picture">
+                  <pic:nvPicPr>
+                    <pic:cNvPr id="0" name="" descr=""/>
+                    <pic:cNvPicPr>
+                      <a:picLocks noChangeAspect="1" noChangeArrowheads="1"/>
+                    </pic:cNvPicPr>
+                  </pic:nvPicPr>
+                  <pic:blipFill>
+                    <a:blip r:embed="rId25" cstate="none"/>
+                    <a:srcRect/>
+                    <a:stretch>
+                      <a:fillRect/>
+                    </a:stretch>
+                  </pic:blipFill>
+                  <pic:spPr bwMode="auto">
+                    <a:xfrm>
+                      <a:off x="0" y="0"/>
+                      <a:ext cx="1219200" cy="123825"/>
+                    </a:xfrm>
+                    <a:prstGeom prst="rect">
+                      <a:avLst/>
+                    </a:prstGeom>
+                  </pic:spPr>
+                </pic:pic>
+              </a:graphicData>
+            </a:graphic>
+          </wp:inline>
+        </w:drawing>
+      </w:r>
+      <w:r>
+        <w:rPr>
+          <w:sz w:val="10"/>
+          <w:szCs w:val="10"/>
+        </w:rPr>
+        <w:br/>
+        <w:t xml:space="preserve"/>
+      </w:r>
+      <w:r>
+        <w:rPr>
+          <w:rFonts w:ascii="Arial" w:cs="Arial" w:eastAsia="Arial" w:hAnsi="Arial"/>
+          <w:color w:val="444444"/>
+          <w:sz w:val="10"/>
+          <w:szCs w:val="10"/>
+        </w:rPr>
+        <w:t xml:space="preserve">Σp is the same for every order</w:t>
       </w:r>
     </w:p>
     <w:p>
@@ -8097,143 +8746,48 @@
           <w:left w:val="single" w:color="1D5FB4" w:sz="12" w:space="2"/>
         </w:pBdr>
         <w:shd w:fill="EEF3FB" w:color="auto" w:val="clear"/>
-        <w:spacing w:after="0" w:before="0" w:line="124" w:lineRule="atLeast"/>
+        <w:spacing w:after="2" w:before="0" w:line="124" w:lineRule="atLeast"/>
         <w:ind w:left="60"/>
       </w:pPr>
       <w:r>
-        <w:rPr>
-          <w:rFonts w:ascii="Arial" w:cs="Arial" w:eastAsia="Arial" w:hAnsi="Arial"/>
-          <w:b/>
-          <w:bCs/>
-          <w:sz w:val="10"/>
-          <w:szCs w:val="10"/>
-        </w:rPr>
-        <w:t xml:space="preserve">Total: ΣC</w:t>
-      </w:r>
-      <w:r>
-        <w:rPr>
-          <w:rFonts w:ascii="Arial" w:cs="Arial" w:eastAsia="Arial" w:hAnsi="Arial"/>
-          <w:b/>
-          <w:bCs/>
-          <w:sz w:val="10"/>
-          <w:szCs w:val="10"/>
-          <w:vertAlign w:val="subscript"/>
-        </w:rPr>
-        <w:t xml:space="preserve">i</w:t>
-      </w:r>
-      <w:r>
-        <w:rPr>
-          <w:rFonts w:ascii="Arial" w:cs="Arial" w:eastAsia="Arial" w:hAnsi="Arial"/>
-          <w:b/>
-          <w:bCs/>
-          <w:sz w:val="10"/>
-          <w:szCs w:val="10"/>
-        </w:rPr>
-        <w:t xml:space="preserve"> = ΣW</w:t>
-      </w:r>
-      <w:r>
-        <w:rPr>
-          <w:rFonts w:ascii="Arial" w:cs="Arial" w:eastAsia="Arial" w:hAnsi="Arial"/>
-          <w:b/>
-          <w:bCs/>
-          <w:sz w:val="10"/>
-          <w:szCs w:val="10"/>
-          <w:vertAlign w:val="subscript"/>
-        </w:rPr>
-        <w:t xml:space="preserve">i</w:t>
-      </w:r>
-      <w:r>
-        <w:rPr>
-          <w:rFonts w:ascii="Arial" w:cs="Arial" w:eastAsia="Arial" w:hAnsi="Arial"/>
-          <w:b/>
-          <w:bCs/>
-          <w:sz w:val="10"/>
-          <w:szCs w:val="10"/>
-        </w:rPr>
-        <w:t xml:space="preserve"> + Σp</w:t>
-      </w:r>
-      <w:r>
-        <w:rPr>
-          <w:rFonts w:ascii="Arial" w:cs="Arial" w:eastAsia="Arial" w:hAnsi="Arial"/>
-          <w:b/>
-          <w:bCs/>
-          <w:sz w:val="10"/>
-          <w:szCs w:val="10"/>
-          <w:vertAlign w:val="subscript"/>
-        </w:rPr>
-        <w:t xml:space="preserve">i</w:t>
-      </w:r>
-      <w:r>
-        <w:rPr>
-          <w:rFonts w:ascii="Arial" w:cs="Arial" w:eastAsia="Arial" w:hAnsi="Arial"/>
-          <w:b/>
-          <w:bCs/>
-          <w:sz w:val="10"/>
-          <w:szCs w:val="10"/>
-        </w:rPr>
-        <w:t xml:space="preserve">   (Σp</w:t>
-      </w:r>
-      <w:r>
-        <w:rPr>
-          <w:rFonts w:ascii="Arial" w:cs="Arial" w:eastAsia="Arial" w:hAnsi="Arial"/>
-          <w:b/>
-          <w:bCs/>
-          <w:sz w:val="10"/>
-          <w:szCs w:val="10"/>
-          <w:vertAlign w:val="subscript"/>
-        </w:rPr>
-        <w:t xml:space="preserve">i</w:t>
-      </w:r>
-      <w:r>
-        <w:rPr>
-          <w:rFonts w:ascii="Arial" w:cs="Arial" w:eastAsia="Arial" w:hAnsi="Arial"/>
-          <w:b/>
-          <w:bCs/>
-          <w:sz w:val="10"/>
-          <w:szCs w:val="10"/>
-        </w:rPr>
-        <w:t xml:space="preserve"> is the same for every order)</w:t>
-      </w:r>
-    </w:p>
-    <w:p>
-      <w:pPr>
-        <w:pBdr>
-          <w:left w:val="single" w:color="1D5FB4" w:sz="12" w:space="2"/>
-        </w:pBdr>
-        <w:shd w:fill="EEF3FB" w:color="auto" w:val="clear"/>
-        <w:spacing w:after="0" w:before="0" w:line="124" w:lineRule="atLeast"/>
-        <w:ind w:left="60"/>
-      </w:pPr>
-      <w:r>
-        <w:rPr>
-          <w:rFonts w:ascii="Arial" w:cs="Arial" w:eastAsia="Arial" w:hAnsi="Arial"/>
-          <w:b/>
-          <w:bCs/>
-          <w:sz w:val="10"/>
-          <w:szCs w:val="10"/>
-        </w:rPr>
-        <w:t xml:space="preserve">SPT rule: serve in order of SMALLEST p</w:t>
-      </w:r>
-      <w:r>
-        <w:rPr>
-          <w:rFonts w:ascii="Arial" w:cs="Arial" w:eastAsia="Arial" w:hAnsi="Arial"/>
-          <w:b/>
-          <w:bCs/>
-          <w:sz w:val="10"/>
-          <w:szCs w:val="10"/>
-          <w:vertAlign w:val="subscript"/>
-        </w:rPr>
-        <w:t xml:space="preserve">i</w:t>
-      </w:r>
-      <w:r>
-        <w:rPr>
-          <w:rFonts w:ascii="Arial" w:cs="Arial" w:eastAsia="Arial" w:hAnsi="Arial"/>
-          <w:b/>
-          <w:bCs/>
-          <w:sz w:val="10"/>
-          <w:szCs w:val="10"/>
-        </w:rPr>
-        <w:t xml:space="preserve"> first ⇒ minimises total completion AND total waiting</w:t>
+        <w:drawing>
+          <wp:inline distT="0" distB="0" distL="0" distR="0">
+            <wp:extent cx="2181225" cy="190500"/>
+            <wp:effectExtent t="0" r="0" b="0" l="0"/>
+            <wp:docPr id="1" name="spt" descr="spt" title="spt"/>
+            <wp:cNvGraphicFramePr>
+              <a:graphicFrameLocks xmlns:a="http://schemas.openxmlformats.org/drawingml/2006/main" noChangeAspect="1"/>
+            </wp:cNvGraphicFramePr>
+            <a:graphic xmlns:a="http://schemas.openxmlformats.org/drawingml/2006/main">
+              <a:graphicData uri="http://schemas.openxmlformats.org/drawingml/2006/picture">
+                <pic:pic xmlns:pic="http://schemas.openxmlformats.org/drawingml/2006/picture">
+                  <pic:nvPicPr>
+                    <pic:cNvPr id="0" name="" descr=""/>
+                    <pic:cNvPicPr>
+                      <a:picLocks noChangeAspect="1" noChangeArrowheads="1"/>
+                    </pic:cNvPicPr>
+                  </pic:nvPicPr>
+                  <pic:blipFill>
+                    <a:blip r:embed="rId26" cstate="none"/>
+                    <a:srcRect/>
+                    <a:stretch>
+                      <a:fillRect/>
+                    </a:stretch>
+                  </pic:blipFill>
+                  <pic:spPr bwMode="auto">
+                    <a:xfrm>
+                      <a:off x="0" y="0"/>
+                      <a:ext cx="2181225" cy="190500"/>
+                    </a:xfrm>
+                    <a:prstGeom prst="rect">
+                      <a:avLst/>
+                    </a:prstGeom>
+                  </pic:spPr>
+                </pic:pic>
+              </a:graphicData>
+            </a:graphic>
+          </wp:inline>
+        </w:drawing>
       </w:r>
     </w:p>
     <w:p>
@@ -8253,49 +8807,7 @@
           <w:sz w:val="10"/>
           <w:szCs w:val="10"/>
         </w:rPr>
-        <w:t xml:space="preserve">WSPT rule (with priorities): serve in order of SMALLEST p</w:t>
-      </w:r>
-      <w:r>
-        <w:rPr>
-          <w:rFonts w:ascii="Arial" w:cs="Arial" w:eastAsia="Arial" w:hAnsi="Arial"/>
-          <w:b/>
-          <w:bCs/>
-          <w:sz w:val="10"/>
-          <w:szCs w:val="10"/>
-          <w:vertAlign w:val="subscript"/>
-        </w:rPr>
-        <w:t xml:space="preserve">i</w:t>
-      </w:r>
-      <w:r>
-        <w:rPr>
-          <w:rFonts w:ascii="Arial" w:cs="Arial" w:eastAsia="Arial" w:hAnsi="Arial"/>
-          <w:b/>
-          <w:bCs/>
-          <w:sz w:val="10"/>
-          <w:szCs w:val="10"/>
-        </w:rPr>
-        <w:t xml:space="preserve"> ÷ w</w:t>
-      </w:r>
-      <w:r>
-        <w:rPr>
-          <w:rFonts w:ascii="Arial" w:cs="Arial" w:eastAsia="Arial" w:hAnsi="Arial"/>
-          <w:b/>
-          <w:bCs/>
-          <w:sz w:val="10"/>
-          <w:szCs w:val="10"/>
-          <w:vertAlign w:val="subscript"/>
-        </w:rPr>
-        <w:t xml:space="preserve">i</w:t>
-      </w:r>
-      <w:r>
-        <w:rPr>
-          <w:rFonts w:ascii="Arial" w:cs="Arial" w:eastAsia="Arial" w:hAnsi="Arial"/>
-          <w:b/>
-          <w:bCs/>
-          <w:sz w:val="10"/>
-          <w:szCs w:val="10"/>
-        </w:rPr>
-        <w:t xml:space="preserve"> first ⇒ minimises Σw</w:t>
+        <w:t xml:space="preserve">SPT minimises total completion and total waiting; WSPT minimises the weighted totals Σw</w:t>
       </w:r>
       <w:r>
         <w:rPr>
@@ -12282,18 +12794,57 @@
           <w:left w:val="single" w:color="1D5FB4" w:sz="12" w:space="2"/>
         </w:pBdr>
         <w:shd w:fill="EEF3FB" w:color="auto" w:val="clear"/>
-        <w:spacing w:after="0" w:before="10" w:line="124" w:lineRule="atLeast"/>
+        <w:spacing w:after="2" w:before="10" w:line="124" w:lineRule="atLeast"/>
         <w:ind w:left="60"/>
       </w:pPr>
       <w:r>
-        <w:rPr>
-          <w:rFonts w:ascii="Arial" w:cs="Arial" w:eastAsia="Arial" w:hAnsi="Arial"/>
-          <w:b/>
-          <w:bCs/>
-          <w:sz w:val="10"/>
-          <w:szCs w:val="10"/>
-        </w:rPr>
-        <w:t xml:space="preserve">Expected value (mean):  E[X] = Σ value × probability</w:t>
+        <w:drawing>
+          <wp:inline distT="0" distB="0" distL="0" distR="0">
+            <wp:extent cx="800100" cy="171450"/>
+            <wp:effectExtent t="0" r="0" b="0" l="0"/>
+            <wp:docPr id="1" name="mean" descr="mean" title="mean"/>
+            <wp:cNvGraphicFramePr>
+              <a:graphicFrameLocks xmlns:a="http://schemas.openxmlformats.org/drawingml/2006/main" noChangeAspect="1"/>
+            </wp:cNvGraphicFramePr>
+            <a:graphic xmlns:a="http://schemas.openxmlformats.org/drawingml/2006/main">
+              <a:graphicData uri="http://schemas.openxmlformats.org/drawingml/2006/picture">
+                <pic:pic xmlns:pic="http://schemas.openxmlformats.org/drawingml/2006/picture">
+                  <pic:nvPicPr>
+                    <pic:cNvPr id="0" name="" descr=""/>
+                    <pic:cNvPicPr>
+                      <a:picLocks noChangeAspect="1" noChangeArrowheads="1"/>
+                    </pic:cNvPicPr>
+                  </pic:nvPicPr>
+                  <pic:blipFill>
+                    <a:blip r:embed="rId27" cstate="none"/>
+                    <a:srcRect/>
+                    <a:stretch>
+                      <a:fillRect/>
+                    </a:stretch>
+                  </pic:blipFill>
+                  <pic:spPr bwMode="auto">
+                    <a:xfrm>
+                      <a:off x="0" y="0"/>
+                      <a:ext cx="800100" cy="171450"/>
+                    </a:xfrm>
+                    <a:prstGeom prst="rect">
+                      <a:avLst/>
+                    </a:prstGeom>
+                  </pic:spPr>
+                </pic:pic>
+              </a:graphicData>
+            </a:graphic>
+          </wp:inline>
+        </w:drawing>
+      </w:r>
+      <w:r>
+        <w:rPr>
+          <w:rFonts w:ascii="Arial" w:cs="Arial" w:eastAsia="Arial" w:hAnsi="Arial"/>
+          <w:color w:val="444444"/>
+          <w:sz w:val="10"/>
+          <w:szCs w:val="10"/>
+        </w:rPr>
+        <w:t xml:space="preserve">  the prediction</w:t>
       </w:r>
     </w:p>
     <w:p>
@@ -12302,38 +12853,65 @@
           <w:left w:val="single" w:color="1D5FB4" w:sz="12" w:space="2"/>
         </w:pBdr>
         <w:shd w:fill="EEF3FB" w:color="auto" w:val="clear"/>
-        <w:spacing w:after="0" w:before="0" w:line="124" w:lineRule="atLeast"/>
+        <w:spacing w:after="2" w:before="0" w:line="124" w:lineRule="atLeast"/>
         <w:ind w:left="60"/>
       </w:pPr>
       <w:r>
-        <w:rPr>
-          <w:rFonts w:ascii="Arial" w:cs="Arial" w:eastAsia="Arial" w:hAnsi="Arial"/>
-          <w:b/>
-          <w:bCs/>
-          <w:sz w:val="10"/>
-          <w:szCs w:val="10"/>
-        </w:rPr>
-        <w:t xml:space="preserve">Variance:  Var(X) = E[(X − E[X])²]  = average squared error   (units²)</w:t>
-      </w:r>
-    </w:p>
-    <w:p>
-      <w:pPr>
-        <w:pBdr>
-          <w:left w:val="single" w:color="1D5FB4" w:sz="12" w:space="2"/>
-        </w:pBdr>
-        <w:shd w:fill="EEF3FB" w:color="auto" w:val="clear"/>
-        <w:spacing w:after="0" w:before="0" w:line="124" w:lineRule="atLeast"/>
-        <w:ind w:left="60"/>
-      </w:pPr>
-      <w:r>
-        <w:rPr>
-          <w:rFonts w:ascii="Arial" w:cs="Arial" w:eastAsia="Arial" w:hAnsi="Arial"/>
-          <w:b/>
-          <w:bCs/>
-          <w:sz w:val="10"/>
-          <w:szCs w:val="10"/>
-        </w:rPr>
-        <w:t xml:space="preserve">Standard deviation:  σ = √Var   (same units as X)</w:t>
+        <w:drawing>
+          <wp:inline distT="0" distB="0" distL="0" distR="0">
+            <wp:extent cx="1838325" cy="171450"/>
+            <wp:effectExtent t="0" r="0" b="0" l="0"/>
+            <wp:docPr id="1" name="var" descr="var" title="var"/>
+            <wp:cNvGraphicFramePr>
+              <a:graphicFrameLocks xmlns:a="http://schemas.openxmlformats.org/drawingml/2006/main" noChangeAspect="1"/>
+            </wp:cNvGraphicFramePr>
+            <a:graphic xmlns:a="http://schemas.openxmlformats.org/drawingml/2006/main">
+              <a:graphicData uri="http://schemas.openxmlformats.org/drawingml/2006/picture">
+                <pic:pic xmlns:pic="http://schemas.openxmlformats.org/drawingml/2006/picture">
+                  <pic:nvPicPr>
+                    <pic:cNvPr id="0" name="" descr=""/>
+                    <pic:cNvPicPr>
+                      <a:picLocks noChangeAspect="1" noChangeArrowheads="1"/>
+                    </pic:cNvPicPr>
+                  </pic:nvPicPr>
+                  <pic:blipFill>
+                    <a:blip r:embed="rId28" cstate="none"/>
+                    <a:srcRect/>
+                    <a:stretch>
+                      <a:fillRect/>
+                    </a:stretch>
+                  </pic:blipFill>
+                  <pic:spPr bwMode="auto">
+                    <a:xfrm>
+                      <a:off x="0" y="0"/>
+                      <a:ext cx="1838325" cy="171450"/>
+                    </a:xfrm>
+                    <a:prstGeom prst="rect">
+                      <a:avLst/>
+                    </a:prstGeom>
+                  </pic:spPr>
+                </pic:pic>
+              </a:graphicData>
+            </a:graphic>
+          </wp:inline>
+        </w:drawing>
+      </w:r>
+      <w:r>
+        <w:rPr>
+          <w:sz w:val="10"/>
+          <w:szCs w:val="10"/>
+        </w:rPr>
+        <w:br/>
+        <w:t xml:space="preserve"/>
+      </w:r>
+      <w:r>
+        <w:rPr>
+          <w:rFonts w:ascii="Arial" w:cs="Arial" w:eastAsia="Arial" w:hAnsi="Arial"/>
+          <w:color w:val="444444"/>
+          <w:sz w:val="10"/>
+          <w:szCs w:val="10"/>
+        </w:rPr>
+        <w:t xml:space="preserve">avg squared error (units²)</w:t>
       </w:r>
     </w:p>
     <w:p>
@@ -12346,14 +12924,53 @@
         <w:ind w:left="60"/>
       </w:pPr>
       <w:r>
-        <w:rPr>
-          <w:rFonts w:ascii="Arial" w:cs="Arial" w:eastAsia="Arial" w:hAnsi="Arial"/>
-          <w:b/>
-          <w:bCs/>
-          <w:sz w:val="10"/>
-          <w:szCs w:val="10"/>
-        </w:rPr>
-        <w:t xml:space="preserve">Coefficient of variation:  CV = σ ÷ E[X]   (no units; how big the spread is compared with the mean)</w:t>
+        <w:drawing>
+          <wp:inline distT="0" distB="0" distL="0" distR="0">
+            <wp:extent cx="990600" cy="190500"/>
+            <wp:effectExtent t="0" r="0" b="0" l="0"/>
+            <wp:docPr id="1" name="sdcv" descr="sdcv" title="sdcv"/>
+            <wp:cNvGraphicFramePr>
+              <a:graphicFrameLocks xmlns:a="http://schemas.openxmlformats.org/drawingml/2006/main" noChangeAspect="1"/>
+            </wp:cNvGraphicFramePr>
+            <a:graphic xmlns:a="http://schemas.openxmlformats.org/drawingml/2006/main">
+              <a:graphicData uri="http://schemas.openxmlformats.org/drawingml/2006/picture">
+                <pic:pic xmlns:pic="http://schemas.openxmlformats.org/drawingml/2006/picture">
+                  <pic:nvPicPr>
+                    <pic:cNvPr id="0" name="" descr=""/>
+                    <pic:cNvPicPr>
+                      <a:picLocks noChangeAspect="1" noChangeArrowheads="1"/>
+                    </pic:cNvPicPr>
+                  </pic:nvPicPr>
+                  <pic:blipFill>
+                    <a:blip r:embed="rId29" cstate="none"/>
+                    <a:srcRect/>
+                    <a:stretch>
+                      <a:fillRect/>
+                    </a:stretch>
+                  </pic:blipFill>
+                  <pic:spPr bwMode="auto">
+                    <a:xfrm>
+                      <a:off x="0" y="0"/>
+                      <a:ext cx="990600" cy="190500"/>
+                    </a:xfrm>
+                    <a:prstGeom prst="rect">
+                      <a:avLst/>
+                    </a:prstGeom>
+                  </pic:spPr>
+                </pic:pic>
+              </a:graphicData>
+            </a:graphic>
+          </wp:inline>
+        </w:drawing>
+      </w:r>
+      <w:r>
+        <w:rPr>
+          <w:rFonts w:ascii="Arial" w:cs="Arial" w:eastAsia="Arial" w:hAnsi="Arial"/>
+          <w:color w:val="444444"/>
+          <w:sz w:val="10"/>
+          <w:szCs w:val="10"/>
+        </w:rPr>
+        <w:t xml:space="preserve">  σ in original units; CV has no unit</w:t>
       </w:r>
     </w:p>
     <w:p>
@@ -13493,18 +14110,57 @@
           <w:left w:val="single" w:color="1D5FB4" w:sz="12" w:space="2"/>
         </w:pBdr>
         <w:shd w:fill="EEF3FB" w:color="auto" w:val="clear"/>
-        <w:spacing w:after="0" w:before="10" w:line="124" w:lineRule="atLeast"/>
+        <w:spacing w:after="2" w:before="10" w:line="124" w:lineRule="atLeast"/>
         <w:ind w:left="60"/>
       </w:pPr>
       <w:r>
-        <w:rPr>
-          <w:rFonts w:ascii="Arial" w:cs="Arial" w:eastAsia="Arial" w:hAnsi="Arial"/>
-          <w:b/>
-          <w:bCs/>
-          <w:sz w:val="10"/>
-          <w:szCs w:val="10"/>
-        </w:rPr>
-        <w:t xml:space="preserve">Utilization:  ρ = λ ÷ μ</w:t>
+        <w:drawing>
+          <wp:inline distT="0" distB="0" distL="0" distR="0">
+            <wp:extent cx="361950" cy="209550"/>
+            <wp:effectExtent t="0" r="0" b="0" l="0"/>
+            <wp:docPr id="1" name="rho1" descr="rho1" title="rho1"/>
+            <wp:cNvGraphicFramePr>
+              <a:graphicFrameLocks xmlns:a="http://schemas.openxmlformats.org/drawingml/2006/main" noChangeAspect="1"/>
+            </wp:cNvGraphicFramePr>
+            <a:graphic xmlns:a="http://schemas.openxmlformats.org/drawingml/2006/main">
+              <a:graphicData uri="http://schemas.openxmlformats.org/drawingml/2006/picture">
+                <pic:pic xmlns:pic="http://schemas.openxmlformats.org/drawingml/2006/picture">
+                  <pic:nvPicPr>
+                    <pic:cNvPr id="0" name="" descr=""/>
+                    <pic:cNvPicPr>
+                      <a:picLocks noChangeAspect="1" noChangeArrowheads="1"/>
+                    </pic:cNvPicPr>
+                  </pic:nvPicPr>
+                  <pic:blipFill>
+                    <a:blip r:embed="rId30" cstate="none"/>
+                    <a:srcRect/>
+                    <a:stretch>
+                      <a:fillRect/>
+                    </a:stretch>
+                  </pic:blipFill>
+                  <pic:spPr bwMode="auto">
+                    <a:xfrm>
+                      <a:off x="0" y="0"/>
+                      <a:ext cx="361950" cy="209550"/>
+                    </a:xfrm>
+                    <a:prstGeom prst="rect">
+                      <a:avLst/>
+                    </a:prstGeom>
+                  </pic:spPr>
+                </pic:pic>
+              </a:graphicData>
+            </a:graphic>
+          </wp:inline>
+        </w:drawing>
+      </w:r>
+      <w:r>
+        <w:rPr>
+          <w:rFonts w:ascii="Arial" w:cs="Arial" w:eastAsia="Arial" w:hAnsi="Arial"/>
+          <w:color w:val="444444"/>
+          <w:sz w:val="10"/>
+          <w:szCs w:val="10"/>
+        </w:rPr>
+        <w:t xml:space="preserve">  utilization; must be &lt; 1 (stable)</w:t>
       </w:r>
     </w:p>
     <w:p>
@@ -13513,81 +14169,57 @@
           <w:left w:val="single" w:color="1D5FB4" w:sz="12" w:space="2"/>
         </w:pBdr>
         <w:shd w:fill="EEF3FB" w:color="auto" w:val="clear"/>
-        <w:spacing w:after="0" w:before="0" w:line="124" w:lineRule="atLeast"/>
+        <w:spacing w:after="2" w:before="0" w:line="124" w:lineRule="atLeast"/>
         <w:ind w:left="60"/>
       </w:pPr>
       <w:r>
-        <w:rPr>
-          <w:rFonts w:ascii="Arial" w:cs="Arial" w:eastAsia="Arial" w:hAnsi="Arial"/>
-          <w:b/>
-          <w:bCs/>
-          <w:sz w:val="10"/>
-          <w:szCs w:val="10"/>
-        </w:rPr>
-        <w:t xml:space="preserve">PK formula (number waiting in queue):  I</w:t>
-      </w:r>
-      <w:r>
-        <w:rPr>
-          <w:rFonts w:ascii="Arial" w:cs="Arial" w:eastAsia="Arial" w:hAnsi="Arial"/>
-          <w:b/>
-          <w:bCs/>
-          <w:sz w:val="10"/>
-          <w:szCs w:val="10"/>
-          <w:vertAlign w:val="subscript"/>
-        </w:rPr>
-        <w:t xml:space="preserve">q</w:t>
-      </w:r>
-      <w:r>
-        <w:rPr>
-          <w:rFonts w:ascii="Arial" w:cs="Arial" w:eastAsia="Arial" w:hAnsi="Arial"/>
-          <w:b/>
-          <w:bCs/>
-          <w:sz w:val="10"/>
-          <w:szCs w:val="10"/>
-        </w:rPr>
-        <w:t xml:space="preserve"> ≈ [ρ² ÷ (1 − ρ)] × [(C</w:t>
-      </w:r>
-      <w:r>
-        <w:rPr>
-          <w:rFonts w:ascii="Arial" w:cs="Arial" w:eastAsia="Arial" w:hAnsi="Arial"/>
-          <w:b/>
-          <w:bCs/>
-          <w:sz w:val="10"/>
-          <w:szCs w:val="10"/>
-          <w:vertAlign w:val="subscript"/>
-        </w:rPr>
-        <w:t xml:space="preserve">A</w:t>
-      </w:r>
-      <w:r>
-        <w:rPr>
-          <w:rFonts w:ascii="Arial" w:cs="Arial" w:eastAsia="Arial" w:hAnsi="Arial"/>
-          <w:b/>
-          <w:bCs/>
-          <w:sz w:val="10"/>
-          <w:szCs w:val="10"/>
-        </w:rPr>
-        <w:t xml:space="preserve">² + C</w:t>
-      </w:r>
-      <w:r>
-        <w:rPr>
-          <w:rFonts w:ascii="Arial" w:cs="Arial" w:eastAsia="Arial" w:hAnsi="Arial"/>
-          <w:b/>
-          <w:bCs/>
-          <w:sz w:val="10"/>
-          <w:szCs w:val="10"/>
-          <w:vertAlign w:val="subscript"/>
-        </w:rPr>
-        <w:t xml:space="preserve">S</w:t>
-      </w:r>
-      <w:r>
-        <w:rPr>
-          <w:rFonts w:ascii="Arial" w:cs="Arial" w:eastAsia="Arial" w:hAnsi="Arial"/>
-          <w:b/>
-          <w:bCs/>
-          <w:sz w:val="10"/>
-          <w:szCs w:val="10"/>
-        </w:rPr>
-        <w:t xml:space="preserve">²) ÷ 2]</w:t>
+        <w:drawing>
+          <wp:inline distT="0" distB="0" distL="0" distR="0">
+            <wp:extent cx="762000" cy="228600"/>
+            <wp:effectExtent t="0" r="0" b="0" l="0"/>
+            <wp:docPr id="1" name="pk1" descr="pk1" title="pk1"/>
+            <wp:cNvGraphicFramePr>
+              <a:graphicFrameLocks xmlns:a="http://schemas.openxmlformats.org/drawingml/2006/main" noChangeAspect="1"/>
+            </wp:cNvGraphicFramePr>
+            <a:graphic xmlns:a="http://schemas.openxmlformats.org/drawingml/2006/main">
+              <a:graphicData uri="http://schemas.openxmlformats.org/drawingml/2006/picture">
+                <pic:pic xmlns:pic="http://schemas.openxmlformats.org/drawingml/2006/picture">
+                  <pic:nvPicPr>
+                    <pic:cNvPr id="0" name="" descr=""/>
+                    <pic:cNvPicPr>
+                      <a:picLocks noChangeAspect="1" noChangeArrowheads="1"/>
+                    </pic:cNvPicPr>
+                  </pic:nvPicPr>
+                  <pic:blipFill>
+                    <a:blip r:embed="rId31" cstate="none"/>
+                    <a:srcRect/>
+                    <a:stretch>
+                      <a:fillRect/>
+                    </a:stretch>
+                  </pic:blipFill>
+                  <pic:spPr bwMode="auto">
+                    <a:xfrm>
+                      <a:off x="0" y="0"/>
+                      <a:ext cx="762000" cy="228600"/>
+                    </a:xfrm>
+                    <a:prstGeom prst="rect">
+                      <a:avLst/>
+                    </a:prstGeom>
+                  </pic:spPr>
+                </pic:pic>
+              </a:graphicData>
+            </a:graphic>
+          </wp:inline>
+        </w:drawing>
+      </w:r>
+      <w:r>
+        <w:rPr>
+          <w:rFonts w:ascii="Arial" w:cs="Arial" w:eastAsia="Arial" w:hAnsi="Arial"/>
+          <w:color w:val="444444"/>
+          <w:sz w:val="10"/>
+          <w:szCs w:val="10"/>
+        </w:rPr>
+        <w:t xml:space="preserve">  people WAITING (not being served)</w:t>
       </w:r>
     </w:p>
     <w:p>
@@ -13596,60 +14228,48 @@
           <w:left w:val="single" w:color="1D5FB4" w:sz="12" w:space="2"/>
         </w:pBdr>
         <w:shd w:fill="EEF3FB" w:color="auto" w:val="clear"/>
-        <w:spacing w:after="0" w:before="0" w:line="124" w:lineRule="atLeast"/>
+        <w:spacing w:after="2" w:before="0" w:line="124" w:lineRule="atLeast"/>
         <w:ind w:left="60"/>
       </w:pPr>
       <w:r>
-        <w:rPr>
-          <w:rFonts w:ascii="Arial" w:cs="Arial" w:eastAsia="Arial" w:hAnsi="Arial"/>
-          <w:b/>
-          <w:bCs/>
-          <w:sz w:val="10"/>
-          <w:szCs w:val="10"/>
-        </w:rPr>
-        <w:t xml:space="preserve">Time waiting in queue:  T</w:t>
-      </w:r>
-      <w:r>
-        <w:rPr>
-          <w:rFonts w:ascii="Arial" w:cs="Arial" w:eastAsia="Arial" w:hAnsi="Arial"/>
-          <w:b/>
-          <w:bCs/>
-          <w:sz w:val="10"/>
-          <w:szCs w:val="10"/>
-          <w:vertAlign w:val="subscript"/>
-        </w:rPr>
-        <w:t xml:space="preserve">q</w:t>
-      </w:r>
-      <w:r>
-        <w:rPr>
-          <w:rFonts w:ascii="Arial" w:cs="Arial" w:eastAsia="Arial" w:hAnsi="Arial"/>
-          <w:b/>
-          <w:bCs/>
-          <w:sz w:val="10"/>
-          <w:szCs w:val="10"/>
-        </w:rPr>
-        <w:t xml:space="preserve"> = I</w:t>
-      </w:r>
-      <w:r>
-        <w:rPr>
-          <w:rFonts w:ascii="Arial" w:cs="Arial" w:eastAsia="Arial" w:hAnsi="Arial"/>
-          <w:b/>
-          <w:bCs/>
-          <w:sz w:val="10"/>
-          <w:szCs w:val="10"/>
-          <w:vertAlign w:val="subscript"/>
-        </w:rPr>
-        <w:t xml:space="preserve">q</w:t>
-      </w:r>
-      <w:r>
-        <w:rPr>
-          <w:rFonts w:ascii="Arial" w:cs="Arial" w:eastAsia="Arial" w:hAnsi="Arial"/>
-          <w:b/>
-          <w:bCs/>
-          <w:sz w:val="10"/>
-          <w:szCs w:val="10"/>
-        </w:rPr>
-        <w:t xml:space="preserve"> ÷ λ     (Little's Law)</w:t>
+        <w:drawing>
+          <wp:inline distT="0" distB="0" distL="0" distR="0">
+            <wp:extent cx="1133475" cy="209550"/>
+            <wp:effectExtent t="0" r="0" b="0" l="0"/>
+            <wp:docPr id="1" name="tq1" descr="tq1" title="tq1"/>
+            <wp:cNvGraphicFramePr>
+              <a:graphicFrameLocks xmlns:a="http://schemas.openxmlformats.org/drawingml/2006/main" noChangeAspect="1"/>
+            </wp:cNvGraphicFramePr>
+            <a:graphic xmlns:a="http://schemas.openxmlformats.org/drawingml/2006/main">
+              <a:graphicData uri="http://schemas.openxmlformats.org/drawingml/2006/picture">
+                <pic:pic xmlns:pic="http://schemas.openxmlformats.org/drawingml/2006/picture">
+                  <pic:nvPicPr>
+                    <pic:cNvPr id="0" name="" descr=""/>
+                    <pic:cNvPicPr>
+                      <a:picLocks noChangeAspect="1" noChangeArrowheads="1"/>
+                    </pic:cNvPicPr>
+                  </pic:nvPicPr>
+                  <pic:blipFill>
+                    <a:blip r:embed="rId32" cstate="none"/>
+                    <a:srcRect/>
+                    <a:stretch>
+                      <a:fillRect/>
+                    </a:stretch>
+                  </pic:blipFill>
+                  <pic:spPr bwMode="auto">
+                    <a:xfrm>
+                      <a:off x="0" y="0"/>
+                      <a:ext cx="1133475" cy="209550"/>
+                    </a:xfrm>
+                    <a:prstGeom prst="rect">
+                      <a:avLst/>
+                    </a:prstGeom>
+                  </pic:spPr>
+                </pic:pic>
+              </a:graphicData>
+            </a:graphic>
+          </wp:inline>
+        </w:drawing>
       </w:r>
     </w:p>
     <w:p>
@@ -13658,60 +14278,65 @@
           <w:left w:val="single" w:color="1D5FB4" w:sz="12" w:space="2"/>
         </w:pBdr>
         <w:shd w:fill="EEF3FB" w:color="auto" w:val="clear"/>
-        <w:spacing w:after="0" w:before="0" w:line="124" w:lineRule="atLeast"/>
+        <w:spacing w:after="2" w:before="0" w:line="124" w:lineRule="atLeast"/>
         <w:ind w:left="60"/>
       </w:pPr>
       <w:r>
-        <w:rPr>
-          <w:rFonts w:ascii="Arial" w:cs="Arial" w:eastAsia="Arial" w:hAnsi="Arial"/>
-          <w:b/>
-          <w:bCs/>
-          <w:sz w:val="10"/>
-          <w:szCs w:val="10"/>
-        </w:rPr>
-        <w:t xml:space="preserve">Being served:  T</w:t>
-      </w:r>
-      <w:r>
-        <w:rPr>
-          <w:rFonts w:ascii="Arial" w:cs="Arial" w:eastAsia="Arial" w:hAnsi="Arial"/>
-          <w:b/>
-          <w:bCs/>
-          <w:sz w:val="10"/>
-          <w:szCs w:val="10"/>
-          <w:vertAlign w:val="subscript"/>
-        </w:rPr>
-        <w:t xml:space="preserve">s</w:t>
-      </w:r>
-      <w:r>
-        <w:rPr>
-          <w:rFonts w:ascii="Arial" w:cs="Arial" w:eastAsia="Arial" w:hAnsi="Arial"/>
-          <w:b/>
-          <w:bCs/>
-          <w:sz w:val="10"/>
-          <w:szCs w:val="10"/>
-        </w:rPr>
-        <w:t xml:space="preserve"> = 1 ÷ μ ,   I</w:t>
-      </w:r>
-      <w:r>
-        <w:rPr>
-          <w:rFonts w:ascii="Arial" w:cs="Arial" w:eastAsia="Arial" w:hAnsi="Arial"/>
-          <w:b/>
-          <w:bCs/>
-          <w:sz w:val="10"/>
-          <w:szCs w:val="10"/>
-          <w:vertAlign w:val="subscript"/>
-        </w:rPr>
-        <w:t xml:space="preserve">s</w:t>
-      </w:r>
-      <w:r>
-        <w:rPr>
-          <w:rFonts w:ascii="Arial" w:cs="Arial" w:eastAsia="Arial" w:hAnsi="Arial"/>
-          <w:b/>
-          <w:bCs/>
-          <w:sz w:val="10"/>
-          <w:szCs w:val="10"/>
-        </w:rPr>
-        <w:t xml:space="preserve"> = λ ÷ μ = ρ</w:t>
+        <w:drawing>
+          <wp:inline distT="0" distB="0" distL="0" distR="0">
+            <wp:extent cx="1009650" cy="209550"/>
+            <wp:effectExtent t="0" r="0" b="0" l="0"/>
+            <wp:docPr id="1" name="sys1" descr="sys1" title="sys1"/>
+            <wp:cNvGraphicFramePr>
+              <a:graphicFrameLocks xmlns:a="http://schemas.openxmlformats.org/drawingml/2006/main" noChangeAspect="1"/>
+            </wp:cNvGraphicFramePr>
+            <a:graphic xmlns:a="http://schemas.openxmlformats.org/drawingml/2006/main">
+              <a:graphicData uri="http://schemas.openxmlformats.org/drawingml/2006/picture">
+                <pic:pic xmlns:pic="http://schemas.openxmlformats.org/drawingml/2006/picture">
+                  <pic:nvPicPr>
+                    <pic:cNvPr id="0" name="" descr=""/>
+                    <pic:cNvPicPr>
+                      <a:picLocks noChangeAspect="1" noChangeArrowheads="1"/>
+                    </pic:cNvPicPr>
+                  </pic:nvPicPr>
+                  <pic:blipFill>
+                    <a:blip r:embed="rId33" cstate="none"/>
+                    <a:srcRect/>
+                    <a:stretch>
+                      <a:fillRect/>
+                    </a:stretch>
+                  </pic:blipFill>
+                  <pic:spPr bwMode="auto">
+                    <a:xfrm>
+                      <a:off x="0" y="0"/>
+                      <a:ext cx="1009650" cy="209550"/>
+                    </a:xfrm>
+                    <a:prstGeom prst="rect">
+                      <a:avLst/>
+                    </a:prstGeom>
+                  </pic:spPr>
+                </pic:pic>
+              </a:graphicData>
+            </a:graphic>
+          </wp:inline>
+        </w:drawing>
+      </w:r>
+      <w:r>
+        <w:rPr>
+          <w:sz w:val="10"/>
+          <w:szCs w:val="10"/>
+        </w:rPr>
+        <w:br/>
+        <w:t xml:space="preserve"/>
+      </w:r>
+      <w:r>
+        <w:rPr>
+          <w:rFonts w:ascii="Arial" w:cs="Arial" w:eastAsia="Arial" w:hAnsi="Arial"/>
+          <w:color w:val="444444"/>
+          <w:sz w:val="10"/>
+          <w:szCs w:val="10"/>
+        </w:rPr>
+        <w:t xml:space="preserve">whole system = waiting + being served</w:t>
       </w:r>
     </w:p>
     <w:p>
@@ -13724,56 +14349,44 @@
         <w:ind w:left="60"/>
       </w:pPr>
       <w:r>
-        <w:rPr>
-          <w:rFonts w:ascii="Arial" w:cs="Arial" w:eastAsia="Arial" w:hAnsi="Arial"/>
-          <w:b/>
-          <w:bCs/>
-          <w:sz w:val="10"/>
-          <w:szCs w:val="10"/>
-        </w:rPr>
-        <w:t xml:space="preserve">Whole system (waiting + being served):  I = I</w:t>
-      </w:r>
-      <w:r>
-        <w:rPr>
-          <w:rFonts w:ascii="Arial" w:cs="Arial" w:eastAsia="Arial" w:hAnsi="Arial"/>
-          <w:b/>
-          <w:bCs/>
-          <w:sz w:val="10"/>
-          <w:szCs w:val="10"/>
-          <w:vertAlign w:val="subscript"/>
-        </w:rPr>
-        <w:t xml:space="preserve">q</w:t>
-      </w:r>
-      <w:r>
-        <w:rPr>
-          <w:rFonts w:ascii="Arial" w:cs="Arial" w:eastAsia="Arial" w:hAnsi="Arial"/>
-          <w:b/>
-          <w:bCs/>
-          <w:sz w:val="10"/>
-          <w:szCs w:val="10"/>
-        </w:rPr>
-        <w:t xml:space="preserve"> + ρ ,   T = T</w:t>
-      </w:r>
-      <w:r>
-        <w:rPr>
-          <w:rFonts w:ascii="Arial" w:cs="Arial" w:eastAsia="Arial" w:hAnsi="Arial"/>
-          <w:b/>
-          <w:bCs/>
-          <w:sz w:val="10"/>
-          <w:szCs w:val="10"/>
-          <w:vertAlign w:val="subscript"/>
-        </w:rPr>
-        <w:t xml:space="preserve">q</w:t>
-      </w:r>
-      <w:r>
-        <w:rPr>
-          <w:rFonts w:ascii="Arial" w:cs="Arial" w:eastAsia="Arial" w:hAnsi="Arial"/>
-          <w:b/>
-          <w:bCs/>
-          <w:sz w:val="10"/>
-          <w:szCs w:val="10"/>
-        </w:rPr>
-        <w:t xml:space="preserve"> + 1/μ = I ÷ λ</w:t>
+        <w:drawing>
+          <wp:inline distT="0" distB="0" distL="0" distR="0">
+            <wp:extent cx="2000250" cy="228600"/>
+            <wp:effectExtent t="0" r="0" b="0" l="0"/>
+            <wp:docPr id="1" name="mm1" descr="mm1" title="mm1"/>
+            <wp:cNvGraphicFramePr>
+              <a:graphicFrameLocks xmlns:a="http://schemas.openxmlformats.org/drawingml/2006/main" noChangeAspect="1"/>
+            </wp:cNvGraphicFramePr>
+            <a:graphic xmlns:a="http://schemas.openxmlformats.org/drawingml/2006/main">
+              <a:graphicData uri="http://schemas.openxmlformats.org/drawingml/2006/picture">
+                <pic:pic xmlns:pic="http://schemas.openxmlformats.org/drawingml/2006/picture">
+                  <pic:nvPicPr>
+                    <pic:cNvPr id="0" name="" descr=""/>
+                    <pic:cNvPicPr>
+                      <a:picLocks noChangeAspect="1" noChangeArrowheads="1"/>
+                    </pic:cNvPicPr>
+                  </pic:nvPicPr>
+                  <pic:blipFill>
+                    <a:blip r:embed="rId34" cstate="none"/>
+                    <a:srcRect/>
+                    <a:stretch>
+                      <a:fillRect/>
+                    </a:stretch>
+                  </pic:blipFill>
+                  <pic:spPr bwMode="auto">
+                    <a:xfrm>
+                      <a:off x="0" y="0"/>
+                      <a:ext cx="2000250" cy="228600"/>
+                    </a:xfrm>
+                    <a:prstGeom prst="rect">
+                      <a:avLst/>
+                    </a:prstGeom>
+                  </pic:spPr>
+                </pic:pic>
+              </a:graphicData>
+            </a:graphic>
+          </wp:inline>
+        </w:drawing>
       </w:r>
     </w:p>
     <w:p>
@@ -16979,7 +17592,7 @@
                     </pic:cNvPicPr>
                   </pic:nvPicPr>
                   <pic:blipFill>
-                    <a:blip r:embed="rId9" cstate="none"/>
+                    <a:blip r:embed="rId35" cstate="none"/>
                     <a:srcRect/>
                     <a:stretch>
                       <a:fillRect/>
@@ -18089,18 +18702,57 @@
           <w:left w:val="single" w:color="1D5FB4" w:sz="12" w:space="2"/>
         </w:pBdr>
         <w:shd w:fill="EEF3FB" w:color="auto" w:val="clear"/>
-        <w:spacing w:after="0" w:before="10" w:line="124" w:lineRule="atLeast"/>
+        <w:spacing w:after="2" w:before="10" w:line="124" w:lineRule="atLeast"/>
         <w:ind w:left="60"/>
       </w:pPr>
       <w:r>
-        <w:rPr>
-          <w:rFonts w:ascii="Arial" w:cs="Arial" w:eastAsia="Arial" w:hAnsi="Arial"/>
-          <w:b/>
-          <w:bCs/>
-          <w:sz w:val="10"/>
-          <w:szCs w:val="10"/>
-        </w:rPr>
-        <w:t xml:space="preserve">Utilization:  ρ = λ ÷ (c × μ)   (same for the whole pool and for each server)</w:t>
+        <w:drawing>
+          <wp:inline distT="0" distB="0" distL="0" distR="0">
+            <wp:extent cx="419100" cy="209550"/>
+            <wp:effectExtent t="0" r="0" b="0" l="0"/>
+            <wp:docPr id="1" name="rhoc" descr="rhoc" title="rhoc"/>
+            <wp:cNvGraphicFramePr>
+              <a:graphicFrameLocks xmlns:a="http://schemas.openxmlformats.org/drawingml/2006/main" noChangeAspect="1"/>
+            </wp:cNvGraphicFramePr>
+            <a:graphic xmlns:a="http://schemas.openxmlformats.org/drawingml/2006/main">
+              <a:graphicData uri="http://schemas.openxmlformats.org/drawingml/2006/picture">
+                <pic:pic xmlns:pic="http://schemas.openxmlformats.org/drawingml/2006/picture">
+                  <pic:nvPicPr>
+                    <pic:cNvPr id="0" name="" descr=""/>
+                    <pic:cNvPicPr>
+                      <a:picLocks noChangeAspect="1" noChangeArrowheads="1"/>
+                    </pic:cNvPicPr>
+                  </pic:nvPicPr>
+                  <pic:blipFill>
+                    <a:blip r:embed="rId36" cstate="none"/>
+                    <a:srcRect/>
+                    <a:stretch>
+                      <a:fillRect/>
+                    </a:stretch>
+                  </pic:blipFill>
+                  <pic:spPr bwMode="auto">
+                    <a:xfrm>
+                      <a:off x="0" y="0"/>
+                      <a:ext cx="419100" cy="209550"/>
+                    </a:xfrm>
+                    <a:prstGeom prst="rect">
+                      <a:avLst/>
+                    </a:prstGeom>
+                  </pic:spPr>
+                </pic:pic>
+              </a:graphicData>
+            </a:graphic>
+          </wp:inline>
+        </w:drawing>
+      </w:r>
+      <w:r>
+        <w:rPr>
+          <w:rFonts w:ascii="Arial" w:cs="Arial" w:eastAsia="Arial" w:hAnsi="Arial"/>
+          <w:color w:val="444444"/>
+          <w:sz w:val="10"/>
+          <w:szCs w:val="10"/>
+        </w:rPr>
+        <w:t xml:space="preserve">  same for the pool and each server</w:t>
       </w:r>
     </w:p>
     <w:p>
@@ -18109,102 +18761,57 @@
           <w:left w:val="single" w:color="1D5FB4" w:sz="12" w:space="2"/>
         </w:pBdr>
         <w:shd w:fill="EEF3FB" w:color="auto" w:val="clear"/>
-        <w:spacing w:after="0" w:before="0" w:line="124" w:lineRule="atLeast"/>
+        <w:spacing w:after="2" w:before="0" w:line="124" w:lineRule="atLeast"/>
         <w:ind w:left="60"/>
       </w:pPr>
       <w:r>
-        <w:rPr>
-          <w:rFonts w:ascii="Arial" w:cs="Arial" w:eastAsia="Arial" w:hAnsi="Arial"/>
-          <w:b/>
-          <w:bCs/>
-          <w:sz w:val="10"/>
-          <w:szCs w:val="10"/>
-        </w:rPr>
-        <w:t xml:space="preserve">Multi-server PK:  I</w:t>
-      </w:r>
-      <w:r>
-        <w:rPr>
-          <w:rFonts w:ascii="Arial" w:cs="Arial" w:eastAsia="Arial" w:hAnsi="Arial"/>
-          <w:b/>
-          <w:bCs/>
-          <w:sz w:val="10"/>
-          <w:szCs w:val="10"/>
-          <w:vertAlign w:val="subscript"/>
-        </w:rPr>
-        <w:t xml:space="preserve">q</w:t>
-      </w:r>
-      <w:r>
-        <w:rPr>
-          <w:rFonts w:ascii="Arial" w:cs="Arial" w:eastAsia="Arial" w:hAnsi="Arial"/>
-          <w:b/>
-          <w:bCs/>
-          <w:sz w:val="10"/>
-          <w:szCs w:val="10"/>
-        </w:rPr>
-        <w:t xml:space="preserve"> ≈ [ρ</w:t>
-      </w:r>
-      <w:r>
-        <w:rPr>
-          <w:rFonts w:ascii="Arial" w:cs="Arial" w:eastAsia="Arial" w:hAnsi="Arial"/>
-          <w:b/>
-          <w:bCs/>
-          <w:sz w:val="10"/>
-          <w:szCs w:val="10"/>
-          <w:vertAlign w:val="superscript"/>
-        </w:rPr>
-        <w:t xml:space="preserve">√(2(c+1))</w:t>
-      </w:r>
-      <w:r>
-        <w:rPr>
-          <w:rFonts w:ascii="Arial" w:cs="Arial" w:eastAsia="Arial" w:hAnsi="Arial"/>
-          <w:b/>
-          <w:bCs/>
-          <w:sz w:val="10"/>
-          <w:szCs w:val="10"/>
-        </w:rPr>
-        <w:t xml:space="preserve"> ÷ (1 − ρ)] × [(C</w:t>
-      </w:r>
-      <w:r>
-        <w:rPr>
-          <w:rFonts w:ascii="Arial" w:cs="Arial" w:eastAsia="Arial" w:hAnsi="Arial"/>
-          <w:b/>
-          <w:bCs/>
-          <w:sz w:val="10"/>
-          <w:szCs w:val="10"/>
-          <w:vertAlign w:val="subscript"/>
-        </w:rPr>
-        <w:t xml:space="preserve">A</w:t>
-      </w:r>
-      <w:r>
-        <w:rPr>
-          <w:rFonts w:ascii="Arial" w:cs="Arial" w:eastAsia="Arial" w:hAnsi="Arial"/>
-          <w:b/>
-          <w:bCs/>
-          <w:sz w:val="10"/>
-          <w:szCs w:val="10"/>
-        </w:rPr>
-        <w:t xml:space="preserve">² + C</w:t>
-      </w:r>
-      <w:r>
-        <w:rPr>
-          <w:rFonts w:ascii="Arial" w:cs="Arial" w:eastAsia="Arial" w:hAnsi="Arial"/>
-          <w:b/>
-          <w:bCs/>
-          <w:sz w:val="10"/>
-          <w:szCs w:val="10"/>
-          <w:vertAlign w:val="subscript"/>
-        </w:rPr>
-        <w:t xml:space="preserve">S</w:t>
-      </w:r>
-      <w:r>
-        <w:rPr>
-          <w:rFonts w:ascii="Arial" w:cs="Arial" w:eastAsia="Arial" w:hAnsi="Arial"/>
-          <w:b/>
-          <w:bCs/>
-          <w:sz w:val="10"/>
-          <w:szCs w:val="10"/>
-        </w:rPr>
-        <w:t xml:space="preserve">²) ÷ 2]</w:t>
+        <w:drawing>
+          <wp:inline distT="0" distB="0" distL="0" distR="0">
+            <wp:extent cx="876300" cy="247650"/>
+            <wp:effectExtent t="0" r="0" b="0" l="0"/>
+            <wp:docPr id="1" name="pkc" descr="pkc" title="pkc"/>
+            <wp:cNvGraphicFramePr>
+              <a:graphicFrameLocks xmlns:a="http://schemas.openxmlformats.org/drawingml/2006/main" noChangeAspect="1"/>
+            </wp:cNvGraphicFramePr>
+            <a:graphic xmlns:a="http://schemas.openxmlformats.org/drawingml/2006/main">
+              <a:graphicData uri="http://schemas.openxmlformats.org/drawingml/2006/picture">
+                <pic:pic xmlns:pic="http://schemas.openxmlformats.org/drawingml/2006/picture">
+                  <pic:nvPicPr>
+                    <pic:cNvPr id="0" name="" descr=""/>
+                    <pic:cNvPicPr>
+                      <a:picLocks noChangeAspect="1" noChangeArrowheads="1"/>
+                    </pic:cNvPicPr>
+                  </pic:nvPicPr>
+                  <pic:blipFill>
+                    <a:blip r:embed="rId37" cstate="none"/>
+                    <a:srcRect/>
+                    <a:stretch>
+                      <a:fillRect/>
+                    </a:stretch>
+                  </pic:blipFill>
+                  <pic:spPr bwMode="auto">
+                    <a:xfrm>
+                      <a:off x="0" y="0"/>
+                      <a:ext cx="876300" cy="247650"/>
+                    </a:xfrm>
+                    <a:prstGeom prst="rect">
+                      <a:avLst/>
+                    </a:prstGeom>
+                  </pic:spPr>
+                </pic:pic>
+              </a:graphicData>
+            </a:graphic>
+          </wp:inline>
+        </w:drawing>
+      </w:r>
+      <w:r>
+        <w:rPr>
+          <w:rFonts w:ascii="Arial" w:cs="Arial" w:eastAsia="Arial" w:hAnsi="Arial"/>
+          <w:color w:val="444444"/>
+          <w:sz w:val="10"/>
+          <w:szCs w:val="10"/>
+        </w:rPr>
+        <w:t xml:space="preserve">  c = 1 gives the single-server formula</w:t>
       </w:r>
     </w:p>
     <w:p>
@@ -18217,98 +18824,80 @@
         <w:ind w:left="60"/>
       </w:pPr>
       <w:r>
-        <w:rPr>
-          <w:rFonts w:ascii="Arial" w:cs="Arial" w:eastAsia="Arial" w:hAnsi="Arial"/>
-          <w:b/>
-          <w:bCs/>
-          <w:sz w:val="10"/>
-          <w:szCs w:val="10"/>
-        </w:rPr>
-        <w:t xml:space="preserve">T</w:t>
-      </w:r>
-      <w:r>
-        <w:rPr>
-          <w:rFonts w:ascii="Arial" w:cs="Arial" w:eastAsia="Arial" w:hAnsi="Arial"/>
-          <w:b/>
-          <w:bCs/>
+        <w:drawing>
+          <wp:inline distT="0" distB="0" distL="0" distR="0">
+            <wp:extent cx="1333500" cy="209550"/>
+            <wp:effectExtent t="0" r="0" b="0" l="0"/>
+            <wp:docPr id="1" name="tqc" descr="tqc" title="tqc"/>
+            <wp:cNvGraphicFramePr>
+              <a:graphicFrameLocks xmlns:a="http://schemas.openxmlformats.org/drawingml/2006/main" noChangeAspect="1"/>
+            </wp:cNvGraphicFramePr>
+            <a:graphic xmlns:a="http://schemas.openxmlformats.org/drawingml/2006/main">
+              <a:graphicData uri="http://schemas.openxmlformats.org/drawingml/2006/picture">
+                <pic:pic xmlns:pic="http://schemas.openxmlformats.org/drawingml/2006/picture">
+                  <pic:nvPicPr>
+                    <pic:cNvPr id="0" name="" descr=""/>
+                    <pic:cNvPicPr>
+                      <a:picLocks noChangeAspect="1" noChangeArrowheads="1"/>
+                    </pic:cNvPicPr>
+                  </pic:nvPicPr>
+                  <pic:blipFill>
+                    <a:blip r:embed="rId38" cstate="none"/>
+                    <a:srcRect/>
+                    <a:stretch>
+                      <a:fillRect/>
+                    </a:stretch>
+                  </pic:blipFill>
+                  <pic:spPr bwMode="auto">
+                    <a:xfrm>
+                      <a:off x="0" y="0"/>
+                      <a:ext cx="1333500" cy="209550"/>
+                    </a:xfrm>
+                    <a:prstGeom prst="rect">
+                      <a:avLst/>
+                    </a:prstGeom>
+                  </pic:spPr>
+                </pic:pic>
+              </a:graphicData>
+            </a:graphic>
+          </wp:inline>
+        </w:drawing>
+      </w:r>
+      <w:r>
+        <w:rPr>
+          <w:sz w:val="10"/>
+          <w:szCs w:val="10"/>
+        </w:rPr>
+        <w:br/>
+        <w:t xml:space="preserve"/>
+      </w:r>
+      <w:r>
+        <w:rPr>
+          <w:rFonts w:ascii="Arial" w:cs="Arial" w:eastAsia="Arial" w:hAnsi="Arial"/>
+          <w:color w:val="444444"/>
+          <w:sz w:val="10"/>
+          <w:szCs w:val="10"/>
+        </w:rPr>
+        <w:t xml:space="preserve">I</w:t>
+      </w:r>
+      <w:r>
+        <w:rPr>
+          <w:rFonts w:ascii="Arial" w:cs="Arial" w:eastAsia="Arial" w:hAnsi="Arial"/>
+          <w:color w:val="444444"/>
           <w:sz w:val="10"/>
           <w:szCs w:val="10"/>
           <w:vertAlign w:val="subscript"/>
         </w:rPr>
-        <w:t xml:space="preserve">q</w:t>
-      </w:r>
-      <w:r>
-        <w:rPr>
-          <w:rFonts w:ascii="Arial" w:cs="Arial" w:eastAsia="Arial" w:hAnsi="Arial"/>
-          <w:b/>
-          <w:bCs/>
-          <w:sz w:val="10"/>
-          <w:szCs w:val="10"/>
-        </w:rPr>
-        <w:t xml:space="preserve"> = I</w:t>
-      </w:r>
-      <w:r>
-        <w:rPr>
-          <w:rFonts w:ascii="Arial" w:cs="Arial" w:eastAsia="Arial" w:hAnsi="Arial"/>
-          <w:b/>
-          <w:bCs/>
-          <w:sz w:val="10"/>
-          <w:szCs w:val="10"/>
-          <w:vertAlign w:val="subscript"/>
-        </w:rPr>
-        <w:t xml:space="preserve">q</w:t>
-      </w:r>
-      <w:r>
-        <w:rPr>
-          <w:rFonts w:ascii="Arial" w:cs="Arial" w:eastAsia="Arial" w:hAnsi="Arial"/>
-          <w:b/>
-          <w:bCs/>
-          <w:sz w:val="10"/>
-          <w:szCs w:val="10"/>
-        </w:rPr>
-        <w:t xml:space="preserve"> ÷ λ ;  busy servers I</w:t>
-      </w:r>
-      <w:r>
-        <w:rPr>
-          <w:rFonts w:ascii="Arial" w:cs="Arial" w:eastAsia="Arial" w:hAnsi="Arial"/>
-          <w:b/>
-          <w:bCs/>
-          <w:sz w:val="10"/>
-          <w:szCs w:val="10"/>
-          <w:vertAlign w:val="subscript"/>
-        </w:rPr>
         <w:t xml:space="preserve">s</w:t>
       </w:r>
       <w:r>
         <w:rPr>
           <w:rFonts w:ascii="Arial" w:cs="Arial" w:eastAsia="Arial" w:hAnsi="Arial"/>
-          <w:b/>
-          <w:bCs/>
-          <w:sz w:val="10"/>
-          <w:szCs w:val="10"/>
-        </w:rPr>
-        <w:t xml:space="preserve"> = c·ρ = λ/μ ;  T = T</w:t>
-      </w:r>
-      <w:r>
-        <w:rPr>
-          <w:rFonts w:ascii="Arial" w:cs="Arial" w:eastAsia="Arial" w:hAnsi="Arial"/>
-          <w:b/>
-          <w:bCs/>
-          <w:sz w:val="10"/>
-          <w:szCs w:val="10"/>
-          <w:vertAlign w:val="subscript"/>
-        </w:rPr>
-        <w:t xml:space="preserve">q</w:t>
-      </w:r>
-      <w:r>
-        <w:rPr>
-          <w:rFonts w:ascii="Arial" w:cs="Arial" w:eastAsia="Arial" w:hAnsi="Arial"/>
-          <w:b/>
-          <w:bCs/>
-          <w:sz w:val="10"/>
-          <w:szCs w:val="10"/>
-        </w:rPr>
-        <w:t xml:space="preserve"> + 1/μ</w:t>
+          <w:color w:val="444444"/>
+          <w:sz w:val="10"/>
+          <w:szCs w:val="10"/>
+        </w:rPr>
+        <w:t xml:space="preserve"> = number of busy servers</w:t>
       </w:r>
     </w:p>
     <w:tbl>
@@ -19483,17 +20072,17 @@
           <w:sz w:val="10"/>
           <w:szCs w:val="10"/>
         </w:rPr>
-        <w:t xml:space="preserve">Two independent queues (SA12d)</w:t>
-      </w:r>
-      <w:r>
-        <w:rPr>
-          <w:rFonts w:ascii="Arial" w:cs="Arial" w:eastAsia="Arial" w:hAnsi="Arial"/>
-          <w:b w:val="false"/>
-          <w:bCs w:val="false"/>
-          <w:sz w:val="10"/>
-          <w:szCs w:val="10"/>
-        </w:rPr>
-        <w:t xml:space="preserve">: drive-through λ8, μ10 ⇒ I</w:t>
+        <w:t xml:space="preserve">Two independent queues (SA12d, restaurant)</w:t>
+      </w:r>
+      <w:r>
+        <w:rPr>
+          <w:rFonts w:ascii="Arial" w:cs="Arial" w:eastAsia="Arial" w:hAnsi="Arial"/>
+          <w:b w:val="false"/>
+          <w:bCs w:val="false"/>
+          <w:sz w:val="10"/>
+          <w:szCs w:val="10"/>
+        </w:rPr>
+        <w:t xml:space="preserve">: drive-through: 8 orders/hr, 6 min each (μ = 10/hr), M/M/1 ⇒ I</w:t>
       </w:r>
       <w:r>
         <w:rPr>
@@ -19514,7 +20103,7 @@
           <w:sz w:val="10"/>
           <w:szCs w:val="10"/>
         </w:rPr>
-        <w:t xml:space="preserve"> = 64/20 = 16/5, T</w:t>
+        <w:t xml:space="preserve"> = 8² ÷ (10 × 2) = 16/5, T</w:t>
       </w:r>
       <w:r>
         <w:rPr>
@@ -19535,7 +20124,7 @@
           <w:sz w:val="10"/>
           <w:szCs w:val="10"/>
         </w:rPr>
-        <w:t xml:space="preserve"> = 2/5 hr; dining room λ20, μ30 ⇒ I</w:t>
+        <w:t xml:space="preserve"> = (16/5) ÷ 8 = 2/5 hr. Dining room: 20/hr, 2 min each (μ = 30/hr) ⇒ I</w:t>
       </w:r>
       <w:r>
         <w:rPr>
@@ -19556,7 +20145,7 @@
           <w:sz w:val="10"/>
           <w:szCs w:val="10"/>
         </w:rPr>
-        <w:t xml:space="preserve"> = 4/3, T</w:t>
+        <w:t xml:space="preserve"> = 20² ÷ (30 × 10) = 4/3, T</w:t>
       </w:r>
       <w:r>
         <w:rPr>
@@ -19657,17 +20246,17 @@
           <w:sz w:val="10"/>
           <w:szCs w:val="10"/>
         </w:rPr>
-        <w:t xml:space="preserve">Two queues in a row (SA12g)</w:t>
-      </w:r>
-      <w:r>
-        <w:rPr>
-          <w:rFonts w:ascii="Arial" w:cs="Arial" w:eastAsia="Arial" w:hAnsi="Arial"/>
-          <w:b w:val="false"/>
-          <w:bCs w:val="false"/>
-          <w:sz w:val="10"/>
-          <w:szCs w:val="10"/>
-        </w:rPr>
-        <w:t xml:space="preserve">: queue 1 G/M/1: λ15, gaps every 4 min with std dev 1 ⇒ C</w:t>
+        <w:t xml:space="preserve">Two queues in a row (SA12g, helpline)</w:t>
+      </w:r>
+      <w:r>
+        <w:rPr>
+          <w:rFonts w:ascii="Arial" w:cs="Arial" w:eastAsia="Arial" w:hAnsi="Arial"/>
+          <w:b w:val="false"/>
+          <w:bCs w:val="false"/>
+          <w:sz w:val="10"/>
+          <w:szCs w:val="10"/>
+        </w:rPr>
+        <w:t xml:space="preserve">: calls arrive every 4 min on average (λ = 15/hr), std dev 1 min ⇒ C</w:t>
       </w:r>
       <w:r>
         <w:rPr>
@@ -19688,7 +20277,7 @@
           <w:sz w:val="10"/>
           <w:szCs w:val="10"/>
         </w:rPr>
-        <w:t xml:space="preserve"> = 1/4; μ60 ⇒ ρ = 1/4 ⇒ I</w:t>
+        <w:t xml:space="preserve"> = 1/4. Queue 1: Operator 1 takes 60 calls/hr, exponential (C</w:t>
       </w:r>
       <w:r>
         <w:rPr>
@@ -19699,6 +20288,27 @@
           <w:szCs w:val="10"/>
           <w:vertAlign w:val="subscript"/>
         </w:rPr>
+        <w:t xml:space="preserve">S</w:t>
+      </w:r>
+      <w:r>
+        <w:rPr>
+          <w:rFonts w:ascii="Arial" w:cs="Arial" w:eastAsia="Arial" w:hAnsi="Arial"/>
+          <w:b w:val="false"/>
+          <w:bCs w:val="false"/>
+          <w:sz w:val="10"/>
+          <w:szCs w:val="10"/>
+        </w:rPr>
+        <w:t xml:space="preserve"> = 1) ⇒ ρ = 15/60 = 1/4 ⇒ I</w:t>
+      </w:r>
+      <w:r>
+        <w:rPr>
+          <w:rFonts w:ascii="Arial" w:cs="Arial" w:eastAsia="Arial" w:hAnsi="Arial"/>
+          <w:b w:val="false"/>
+          <w:bCs w:val="false"/>
+          <w:sz w:val="10"/>
+          <w:szCs w:val="10"/>
+          <w:vertAlign w:val="subscript"/>
+        </w:rPr>
         <w:t xml:space="preserve">q</w:t>
       </w:r>
       <w:r>
@@ -19709,7 +20319,7 @@
           <w:sz w:val="10"/>
           <w:szCs w:val="10"/>
         </w:rPr>
-        <w:t xml:space="preserve"> = (1/12)(17/32) = 17/384, T</w:t>
+        <w:t xml:space="preserve"> = [(1/16) ÷ (3/4)] × (1/16 + 1)/2 = 17/384, T</w:t>
       </w:r>
       <w:r>
         <w:rPr>
@@ -19730,7 +20340,7 @@
           <w:sz w:val="10"/>
           <w:szCs w:val="10"/>
         </w:rPr>
-        <w:t xml:space="preserve"> ≈ 0.003 hr.</w:t>
+        <w:t xml:space="preserve"> = (17/384) ÷ 15 ≈ 0.003 hr.</w:t>
       </w:r>
     </w:p>
     <w:p>

</xml_diff>